<commit_message>
Append the reference list to the analysis chapters file
Co-Authored-By: Claude Fable 5.1 <noreply@anthropic.com>
Claude-Session: https://claude.ai/code/session_012ZD2wAUBZdU4RRE8wFJx9h
</commit_message>
<xml_diff>
--- a/seminar/סמינריון-פרקים-2-4-ניתוח-הסיפורים.docx
+++ b/seminar/סמינריון-פרקים-2-4-ניתוח-הסיפורים.docx
@@ -1630,6 +1630,375 @@
         <w:t xml:space="preserve">המעבר מן הסיפור המוקדם למאוחר אינו מעבר מכישלון להצלחה. בשני הסיפורים איש אינו פותר את הקושי, ובשניהם ההתמודדות גובה מחיר. מה שהשתנה הוא מקומו של המספר. ב-1994 הוא יורש את ההסבר של אביו ומתרוקן בתוכו. ב-2024 הוא מקבל את ההסבר של הזר בפניו ומחליף אותו בסיפור משלו. ההתמודדות הכנה יותר, על פי קרת המאוחר, אינה זו שמכריזה על היופי הגדול אלא זו שמודה בכאב הקטן. הצוואר התפוס הוא ההיפך מן האנשים החלולים: גוף בלי נאום. ומי שכותב עליו, בניגוד לילד ששתק, אינו חוזר אחרי איש.</w:t>
       </w:r>
     </w:p>
+    <w:p>
+      <w:r>
+        <w:br w:type="page"/>
+      </w:r>
+    </w:p>
+    <w:p>
+      <w:pPr>
+        <w:bidi/>
+        <w:spacing w:after="300" w:line="360"/>
+        <w:jc w:val="center"/>
+      </w:pPr>
+      <w:r>
+        <w:rPr>
+          <w:rFonts w:ascii="David" w:cs="David" w:eastAsia="David" w:hAnsi="David"/>
+          <w:b/>
+          <w:bCs/>
+          <w:sz w:val="30"/>
+          <w:szCs w:val="30"/>
+          <w:rtl/>
+        </w:rPr>
+        <w:t xml:space="preserve">רשימת מקורות</w:t>
+      </w:r>
+    </w:p>
+    <w:p>
+      <w:pPr>
+        <w:bidi/>
+        <w:spacing w:after="160" w:line="360"/>
+        <w:ind w:left="720" w:hanging="720"/>
+        <w:jc w:val="right"/>
+      </w:pPr>
+      <w:r>
+        <w:rPr>
+          <w:rFonts w:ascii="David" w:cs="David" w:eastAsia="David" w:hAnsi="David"/>
+          <w:sz w:val="24"/>
+          <w:szCs w:val="24"/>
+          <w:rtl/>
+        </w:rPr>
+        <w:t xml:space="preserve">כהן, ד' (2015). בשני צירים שונים: תהליך האבל והתקשורת של הורים ואחים שכולים לאחר אבדן ילד בוגר. </w:t>
+      </w:r>
+      <w:r>
+        <w:rPr>
+          <w:rFonts w:ascii="David" w:cs="David" w:eastAsia="David" w:hAnsi="David"/>
+          <w:i/>
+          <w:iCs/>
+          <w:sz w:val="24"/>
+          <w:szCs w:val="24"/>
+          <w:rtl/>
+        </w:rPr>
+        <w:t xml:space="preserve">מפגש לעבודה חינוכית-סוציאלית</w:t>
+      </w:r>
+      <w:r>
+        <w:rPr>
+          <w:rFonts w:ascii="David" w:cs="David" w:eastAsia="David" w:hAnsi="David"/>
+          <w:sz w:val="24"/>
+          <w:szCs w:val="24"/>
+          <w:rtl/>
+        </w:rPr>
+        <w:t xml:space="preserve">, כג(41). https://kitvei-et.efshar.org.il/גיליונות/מפגש-41/</w:t>
+      </w:r>
+    </w:p>
+    <w:p>
+      <w:pPr>
+        <w:bidi/>
+        <w:spacing w:after="160" w:line="360"/>
+        <w:ind w:left="720" w:hanging="720"/>
+        <w:jc w:val="right"/>
+      </w:pPr>
+      <w:r>
+        <w:rPr>
+          <w:rFonts w:ascii="David" w:cs="David" w:eastAsia="David" w:hAnsi="David"/>
+          <w:sz w:val="24"/>
+          <w:szCs w:val="24"/>
+          <w:rtl/>
+        </w:rPr>
+        <w:t xml:space="preserve">קצמן, ר' (2005). געגועים למיתוס: אישיות, אתיקה ואידאולוגיה במיתופואסיס הפוסטמודרני של אתגר קרת. </w:t>
+      </w:r>
+      <w:r>
+        <w:rPr>
+          <w:rFonts w:ascii="David" w:cs="David" w:eastAsia="David" w:hAnsi="David"/>
+          <w:i/>
+          <w:iCs/>
+          <w:sz w:val="24"/>
+          <w:szCs w:val="24"/>
+          <w:rtl/>
+        </w:rPr>
+        <w:t xml:space="preserve">מכאן</w:t>
+      </w:r>
+      <w:r>
+        <w:rPr>
+          <w:rFonts w:ascii="David" w:cs="David" w:eastAsia="David" w:hAnsi="David"/>
+          <w:sz w:val="24"/>
+          <w:szCs w:val="24"/>
+          <w:rtl/>
+        </w:rPr>
+        <w:t xml:space="preserve">, ד, 20-41.</w:t>
+      </w:r>
+    </w:p>
+    <w:p>
+      <w:pPr>
+        <w:bidi/>
+        <w:spacing w:after="160" w:line="360"/>
+        <w:ind w:left="720" w:hanging="720"/>
+        <w:jc w:val="right"/>
+      </w:pPr>
+      <w:r>
+        <w:rPr>
+          <w:rFonts w:ascii="David" w:cs="David" w:eastAsia="David" w:hAnsi="David"/>
+          <w:sz w:val="24"/>
+          <w:szCs w:val="24"/>
+          <w:rtl/>
+        </w:rPr>
+        <w:t xml:space="preserve">קרת, א' (1994). האנשים החלולים. בתוך </w:t>
+      </w:r>
+      <w:r>
+        <w:rPr>
+          <w:rFonts w:ascii="David" w:cs="David" w:eastAsia="David" w:hAnsi="David"/>
+          <w:i/>
+          <w:iCs/>
+          <w:sz w:val="24"/>
+          <w:szCs w:val="24"/>
+          <w:rtl/>
+        </w:rPr>
+        <w:t xml:space="preserve">געגועי לקיסינג'ר</w:t>
+      </w:r>
+      <w:r>
+        <w:rPr>
+          <w:rFonts w:ascii="David" w:cs="David" w:eastAsia="David" w:hAnsi="David"/>
+          <w:sz w:val="24"/>
+          <w:szCs w:val="24"/>
+          <w:rtl/>
+        </w:rPr>
+        <w:t xml:space="preserve">. זמורה-ביתן.</w:t>
+      </w:r>
+    </w:p>
+    <w:p>
+      <w:pPr>
+        <w:bidi/>
+        <w:spacing w:after="160" w:line="360"/>
+        <w:ind w:left="720" w:hanging="720"/>
+        <w:jc w:val="right"/>
+      </w:pPr>
+      <w:r>
+        <w:rPr>
+          <w:rFonts w:ascii="David" w:cs="David" w:eastAsia="David" w:hAnsi="David"/>
+          <w:sz w:val="24"/>
+          <w:szCs w:val="24"/>
+          <w:rtl/>
+        </w:rPr>
+        <w:t xml:space="preserve">קרת, א' (2024). מי כמונו יודע. בתוך </w:t>
+      </w:r>
+      <w:r>
+        <w:rPr>
+          <w:rFonts w:ascii="David" w:cs="David" w:eastAsia="David" w:hAnsi="David"/>
+          <w:i/>
+          <w:iCs/>
+          <w:sz w:val="24"/>
+          <w:szCs w:val="24"/>
+          <w:rtl/>
+        </w:rPr>
+        <w:t xml:space="preserve">אוטוקורקט</w:t>
+      </w:r>
+      <w:r>
+        <w:rPr>
+          <w:rFonts w:ascii="David" w:cs="David" w:eastAsia="David" w:hAnsi="David"/>
+          <w:sz w:val="24"/>
+          <w:szCs w:val="24"/>
+          <w:rtl/>
+        </w:rPr>
+        <w:t xml:space="preserve">. כנרת, זמורה-ביתן, דביר.</w:t>
+      </w:r>
+    </w:p>
+    <w:p>
+      <w:pPr>
+        <w:spacing w:after="160" w:line="360"/>
+        <w:ind w:left="720" w:hanging="720"/>
+        <w:jc w:val="left"/>
+      </w:pPr>
+      <w:r>
+        <w:rPr>
+          <w:rFonts w:ascii="David" w:cs="David" w:eastAsia="David" w:hAnsi="David"/>
+          <w:sz w:val="24"/>
+          <w:szCs w:val="24"/>
+        </w:rPr>
+        <w:t xml:space="preserve">Abramovich, D. (2019). Israeli Holocaust memory in a short story by Etgar Keret. </w:t>
+      </w:r>
+      <w:r>
+        <w:rPr>
+          <w:rFonts w:ascii="David" w:cs="David" w:eastAsia="David" w:hAnsi="David"/>
+          <w:i/>
+          <w:iCs/>
+          <w:sz w:val="24"/>
+          <w:szCs w:val="24"/>
+        </w:rPr>
+        <w:t xml:space="preserve">Australian Journal of Jewish Studies, 32</w:t>
+      </w:r>
+      <w:r>
+        <w:rPr>
+          <w:rFonts w:ascii="David" w:cs="David" w:eastAsia="David" w:hAnsi="David"/>
+          <w:sz w:val="24"/>
+          <w:szCs w:val="24"/>
+        </w:rPr>
+        <w:t xml:space="preserve">, 21-33. http://www.aajs.org.au/wp-content/uploads/2020/03/AJJSvol32_Abramovich_21-33.pdf</w:t>
+      </w:r>
+    </w:p>
+    <w:p>
+      <w:pPr>
+        <w:spacing w:after="160" w:line="360"/>
+        <w:ind w:left="720" w:hanging="720"/>
+        <w:jc w:val="left"/>
+      </w:pPr>
+      <w:r>
+        <w:rPr>
+          <w:rFonts w:ascii="David" w:cs="David" w:eastAsia="David" w:hAnsi="David"/>
+          <w:sz w:val="24"/>
+          <w:szCs w:val="24"/>
+        </w:rPr>
+        <w:t xml:space="preserve">Lazarus, R. S., &amp; Folkman, S. (1984). </w:t>
+      </w:r>
+      <w:r>
+        <w:rPr>
+          <w:rFonts w:ascii="David" w:cs="David" w:eastAsia="David" w:hAnsi="David"/>
+          <w:i/>
+          <w:iCs/>
+          <w:sz w:val="24"/>
+          <w:szCs w:val="24"/>
+        </w:rPr>
+        <w:t xml:space="preserve">Stress, appraisal, and coping</w:t>
+      </w:r>
+      <w:r>
+        <w:rPr>
+          <w:rFonts w:ascii="David" w:cs="David" w:eastAsia="David" w:hAnsi="David"/>
+          <w:sz w:val="24"/>
+          <w:szCs w:val="24"/>
+        </w:rPr>
+        <w:t xml:space="preserve">. Springer.</w:t>
+      </w:r>
+    </w:p>
+    <w:p>
+      <w:pPr>
+        <w:spacing w:after="160" w:line="360"/>
+        <w:ind w:left="720" w:hanging="720"/>
+        <w:jc w:val="left"/>
+      </w:pPr>
+      <w:r>
+        <w:rPr>
+          <w:rFonts w:ascii="David" w:cs="David" w:eastAsia="David" w:hAnsi="David"/>
+          <w:sz w:val="24"/>
+          <w:szCs w:val="24"/>
+        </w:rPr>
+        <w:t xml:space="preserve">Mendelson-Maoz, A. (2018). Keret's "living-dead" and the sacrifice of Israeli masculinity. </w:t>
+      </w:r>
+      <w:r>
+        <w:rPr>
+          <w:rFonts w:ascii="David" w:cs="David" w:eastAsia="David" w:hAnsi="David"/>
+          <w:i/>
+          <w:iCs/>
+          <w:sz w:val="24"/>
+          <w:szCs w:val="24"/>
+        </w:rPr>
+        <w:t xml:space="preserve">BGU Review: A Journal of Israeli Culture</w:t>
+      </w:r>
+      <w:r>
+        <w:rPr>
+          <w:rFonts w:ascii="David" w:cs="David" w:eastAsia="David" w:hAnsi="David"/>
+          <w:sz w:val="24"/>
+          <w:szCs w:val="24"/>
+        </w:rPr>
+        <w:t xml:space="preserve">, Winter 2018. https://in.bgu.ac.il/en/heksherim/BGU%20Review%202018/Adia-Mendelson-Maoz-BGUR.pdf</w:t>
+      </w:r>
+    </w:p>
+    <w:p>
+      <w:pPr>
+        <w:spacing w:after="160" w:line="360"/>
+        <w:ind w:left="720" w:hanging="720"/>
+        <w:jc w:val="left"/>
+      </w:pPr>
+      <w:r>
+        <w:rPr>
+          <w:rFonts w:ascii="David" w:cs="David" w:eastAsia="David" w:hAnsi="David"/>
+          <w:sz w:val="24"/>
+          <w:szCs w:val="24"/>
+        </w:rPr>
+        <w:t xml:space="preserve">Omer-Sherman, R. (2020). "To extract from it some sort of beautiful thing": The Holocaust in the families and fiction of Nava Semel and Etgar Keret. </w:t>
+      </w:r>
+      <w:r>
+        <w:rPr>
+          <w:rFonts w:ascii="David" w:cs="David" w:eastAsia="David" w:hAnsi="David"/>
+          <w:i/>
+          <w:iCs/>
+          <w:sz w:val="24"/>
+          <w:szCs w:val="24"/>
+        </w:rPr>
+        <w:t xml:space="preserve">Humanities, 9</w:t>
+      </w:r>
+      <w:r>
+        <w:rPr>
+          <w:rFonts w:ascii="David" w:cs="David" w:eastAsia="David" w:hAnsi="David"/>
+          <w:sz w:val="24"/>
+          <w:szCs w:val="24"/>
+        </w:rPr>
+        <w:t xml:space="preserve">(4), Article 137. https://doi.org/10.3390/h9040137</w:t>
+      </w:r>
+    </w:p>
+    <w:p>
+      <w:pPr>
+        <w:spacing w:after="160" w:line="360"/>
+        <w:ind w:left="720" w:hanging="720"/>
+        <w:jc w:val="left"/>
+      </w:pPr>
+      <w:r>
+        <w:rPr>
+          <w:rFonts w:ascii="David" w:cs="David" w:eastAsia="David" w:hAnsi="David"/>
+          <w:sz w:val="24"/>
+          <w:szCs w:val="24"/>
+        </w:rPr>
+        <w:t xml:space="preserve">Rubin, S. S. (1999). The two-track model of bereavement: Overview, retrospect, and prospect. </w:t>
+      </w:r>
+      <w:r>
+        <w:rPr>
+          <w:rFonts w:ascii="David" w:cs="David" w:eastAsia="David" w:hAnsi="David"/>
+          <w:i/>
+          <w:iCs/>
+          <w:sz w:val="24"/>
+          <w:szCs w:val="24"/>
+        </w:rPr>
+        <w:t xml:space="preserve">Death Studies, 23</w:t>
+      </w:r>
+      <w:r>
+        <w:rPr>
+          <w:rFonts w:ascii="David" w:cs="David" w:eastAsia="David" w:hAnsi="David"/>
+          <w:sz w:val="24"/>
+          <w:szCs w:val="24"/>
+        </w:rPr>
+        <w:t xml:space="preserve">(8), 681-714. https://doi.org/10.1080/074811899200731</w:t>
+      </w:r>
+    </w:p>
+    <w:p>
+      <w:pPr>
+        <w:spacing w:after="160" w:line="360"/>
+        <w:ind w:left="720" w:hanging="720"/>
+        <w:jc w:val="left"/>
+      </w:pPr>
+      <w:r>
+        <w:rPr>
+          <w:rFonts w:ascii="David" w:cs="David" w:eastAsia="David" w:hAnsi="David"/>
+          <w:sz w:val="24"/>
+          <w:szCs w:val="24"/>
+        </w:rPr>
+        <w:t xml:space="preserve">Schwartz, Y. (2018). Stam: The unbearable lightness of banality, or on the nature of Etgar Keret's humor. </w:t>
+      </w:r>
+      <w:r>
+        <w:rPr>
+          <w:rFonts w:ascii="David" w:cs="David" w:eastAsia="David" w:hAnsi="David"/>
+          <w:i/>
+          <w:iCs/>
+          <w:sz w:val="24"/>
+          <w:szCs w:val="24"/>
+        </w:rPr>
+        <w:t xml:space="preserve">BGU Review: A Journal of Israeli Culture</w:t>
+      </w:r>
+      <w:r>
+        <w:rPr>
+          <w:rFonts w:ascii="David" w:cs="David" w:eastAsia="David" w:hAnsi="David"/>
+          <w:sz w:val="24"/>
+          <w:szCs w:val="24"/>
+        </w:rPr>
+        <w:t xml:space="preserve">, Winter 2018. https://www.bgu.ac.il/media/zpjot1iw/yigal-schwartz-bgur.pdf</w:t>
+      </w:r>
+    </w:p>
     <w:sectPr>
       <w:pgSz w:w="11906" w:h="16838" w:orient="portrait"/>
       <w:pgMar w:top="1440" w:right="1440" w:bottom="1440" w:left="1440" w:header="708" w:footer="708" w:gutter="0"/>

</xml_diff>

<commit_message>
Add analysis chapters with reference list and right-aligned comparison table
Write chapters 2-4 of the seminar paper in full, append the APA 7
reference list on its own page, and right-align the comparison table at
full text width. Update the README file index.

Co-Authored-By: Claude Fable 5.1 <noreply@anthropic.com>
Claude-Session: https://claude.ai/code/session_012ZD2wAUBZdU4RRE8wFJx9h
</commit_message>
<xml_diff>
--- a/seminar/סמינריון-פרקים-2-4-ניתוח-הסיפורים.docx
+++ b/seminar/סמינריון-פרקים-2-4-ניתוח-הסיפורים.docx
@@ -956,7 +956,8 @@
     <w:tbl>
       <w:tblPr>
         <w:bidiVisual/>
-        <w:tblW w:type="dxa" w:w="9000"/>
+        <w:tblW w:type="dxa" w:w="9360"/>
+        <w:jc w:val="right"/>
         <w:tblBorders>
           <w:top w:val="single" w:color="auto" w:sz="4"/>
           <w:left w:val="single" w:color="auto" w:sz="4"/>
@@ -967,14 +968,14 @@
         </w:tblBorders>
       </w:tblPr>
       <w:tblGrid>
-        <w:gridCol w:w="2200"/>
-        <w:gridCol w:w="3400"/>
-        <w:gridCol w:w="3400"/>
+        <w:gridCol w:w="2400"/>
+        <w:gridCol w:w="3480"/>
+        <w:gridCol w:w="3480"/>
       </w:tblGrid>
       <w:tr>
         <w:tc>
           <w:tcPr>
-            <w:tcW w:type="dxa" w:w="2200"/>
+            <w:tcW w:type="dxa" w:w="2400"/>
             <w:shd w:fill="E8E8E8" w:color="auto" w:val="clear"/>
             <w:tcMar>
               <w:top w:type="dxa" w:w="80"/>
@@ -1004,7 +1005,7 @@
         </w:tc>
         <w:tc>
           <w:tcPr>
-            <w:tcW w:type="dxa" w:w="3400"/>
+            <w:tcW w:type="dxa" w:w="3480"/>
             <w:shd w:fill="E8E8E8" w:color="auto" w:val="clear"/>
             <w:tcMar>
               <w:top w:type="dxa" w:w="80"/>
@@ -1034,7 +1035,7 @@
         </w:tc>
         <w:tc>
           <w:tcPr>
-            <w:tcW w:type="dxa" w:w="3400"/>
+            <w:tcW w:type="dxa" w:w="3480"/>
             <w:shd w:fill="E8E8E8" w:color="auto" w:val="clear"/>
             <w:tcMar>
               <w:top w:type="dxa" w:w="80"/>
@@ -1066,7 +1067,7 @@
       <w:tr>
         <w:tc>
           <w:tcPr>
-            <w:tcW w:type="dxa" w:w="2200"/>
+            <w:tcW w:type="dxa" w:w="2400"/>
             <w:tcMar>
               <w:top w:type="dxa" w:w="80"/>
               <w:left w:type="dxa" w:w="100"/>
@@ -1095,7 +1096,7 @@
         </w:tc>
         <w:tc>
           <w:tcPr>
-            <w:tcW w:type="dxa" w:w="3400"/>
+            <w:tcW w:type="dxa" w:w="3480"/>
             <w:tcMar>
               <w:top w:type="dxa" w:w="80"/>
               <w:left w:type="dxa" w:w="100"/>
@@ -1124,7 +1125,7 @@
         </w:tc>
         <w:tc>
           <w:tcPr>
-            <w:tcW w:type="dxa" w:w="3400"/>
+            <w:tcW w:type="dxa" w:w="3480"/>
             <w:tcMar>
               <w:top w:type="dxa" w:w="80"/>
               <w:left w:type="dxa" w:w="100"/>
@@ -1155,7 +1156,7 @@
       <w:tr>
         <w:tc>
           <w:tcPr>
-            <w:tcW w:type="dxa" w:w="2200"/>
+            <w:tcW w:type="dxa" w:w="2400"/>
             <w:tcMar>
               <w:top w:type="dxa" w:w="80"/>
               <w:left w:type="dxa" w:w="100"/>
@@ -1184,7 +1185,7 @@
         </w:tc>
         <w:tc>
           <w:tcPr>
-            <w:tcW w:type="dxa" w:w="3400"/>
+            <w:tcW w:type="dxa" w:w="3480"/>
             <w:tcMar>
               <w:top w:type="dxa" w:w="80"/>
               <w:left w:type="dxa" w:w="100"/>
@@ -1213,7 +1214,7 @@
         </w:tc>
         <w:tc>
           <w:tcPr>
-            <w:tcW w:type="dxa" w:w="3400"/>
+            <w:tcW w:type="dxa" w:w="3480"/>
             <w:tcMar>
               <w:top w:type="dxa" w:w="80"/>
               <w:left w:type="dxa" w:w="100"/>
@@ -1244,7 +1245,7 @@
       <w:tr>
         <w:tc>
           <w:tcPr>
-            <w:tcW w:type="dxa" w:w="2200"/>
+            <w:tcW w:type="dxa" w:w="2400"/>
             <w:tcMar>
               <w:top w:type="dxa" w:w="80"/>
               <w:left w:type="dxa" w:w="100"/>
@@ -1273,7 +1274,7 @@
         </w:tc>
         <w:tc>
           <w:tcPr>
-            <w:tcW w:type="dxa" w:w="3400"/>
+            <w:tcW w:type="dxa" w:w="3480"/>
             <w:tcMar>
               <w:top w:type="dxa" w:w="80"/>
               <w:left w:type="dxa" w:w="100"/>
@@ -1302,7 +1303,7 @@
         </w:tc>
         <w:tc>
           <w:tcPr>
-            <w:tcW w:type="dxa" w:w="3400"/>
+            <w:tcW w:type="dxa" w:w="3480"/>
             <w:tcMar>
               <w:top w:type="dxa" w:w="80"/>
               <w:left w:type="dxa" w:w="100"/>
@@ -1333,7 +1334,7 @@
       <w:tr>
         <w:tc>
           <w:tcPr>
-            <w:tcW w:type="dxa" w:w="2200"/>
+            <w:tcW w:type="dxa" w:w="2400"/>
             <w:tcMar>
               <w:top w:type="dxa" w:w="80"/>
               <w:left w:type="dxa" w:w="100"/>
@@ -1362,7 +1363,7 @@
         </w:tc>
         <w:tc>
           <w:tcPr>
-            <w:tcW w:type="dxa" w:w="3400"/>
+            <w:tcW w:type="dxa" w:w="3480"/>
             <w:tcMar>
               <w:top w:type="dxa" w:w="80"/>
               <w:left w:type="dxa" w:w="100"/>
@@ -1391,7 +1392,7 @@
         </w:tc>
         <w:tc>
           <w:tcPr>
-            <w:tcW w:type="dxa" w:w="3400"/>
+            <w:tcW w:type="dxa" w:w="3480"/>
             <w:tcMar>
               <w:top w:type="dxa" w:w="80"/>
               <w:left w:type="dxa" w:w="100"/>
@@ -1422,7 +1423,7 @@
       <w:tr>
         <w:tc>
           <w:tcPr>
-            <w:tcW w:type="dxa" w:w="2200"/>
+            <w:tcW w:type="dxa" w:w="2400"/>
             <w:tcMar>
               <w:top w:type="dxa" w:w="80"/>
               <w:left w:type="dxa" w:w="100"/>
@@ -1451,7 +1452,7 @@
         </w:tc>
         <w:tc>
           <w:tcPr>
-            <w:tcW w:type="dxa" w:w="3400"/>
+            <w:tcW w:type="dxa" w:w="3480"/>
             <w:tcMar>
               <w:top w:type="dxa" w:w="80"/>
               <w:left w:type="dxa" w:w="100"/>
@@ -1480,7 +1481,7 @@
         </w:tc>
         <w:tc>
           <w:tcPr>
-            <w:tcW w:type="dxa" w:w="3400"/>
+            <w:tcW w:type="dxa" w:w="3480"/>
             <w:tcMar>
               <w:top w:type="dxa" w:w="80"/>
               <w:left w:type="dxa" w:w="100"/>
@@ -1511,7 +1512,7 @@
       <w:tr>
         <w:tc>
           <w:tcPr>
-            <w:tcW w:type="dxa" w:w="2200"/>
+            <w:tcW w:type="dxa" w:w="2400"/>
             <w:tcMar>
               <w:top w:type="dxa" w:w="80"/>
               <w:left w:type="dxa" w:w="100"/>
@@ -1540,7 +1541,7 @@
         </w:tc>
         <w:tc>
           <w:tcPr>
-            <w:tcW w:type="dxa" w:w="3400"/>
+            <w:tcW w:type="dxa" w:w="3480"/>
             <w:tcMar>
               <w:top w:type="dxa" w:w="80"/>
               <w:left w:type="dxa" w:w="100"/>
@@ -1569,7 +1570,7 @@
         </w:tc>
         <w:tc>
           <w:tcPr>
-            <w:tcW w:type="dxa" w:w="3400"/>
+            <w:tcW w:type="dxa" w:w="3480"/>
             <w:tcMar>
               <w:top w:type="dxa" w:w="80"/>
               <w:left w:type="dxa" w:w="100"/>
@@ -1600,9 +1601,7 @@
     </w:tbl>
     <w:p>
       <w:pPr>
-        <w:bidi/>
-        <w:spacing w:after="120" w:line="360"/>
-        <w:jc w:val="both"/>
+        <w:spacing w:after="0" w:line="240"/>
       </w:pPr>
       <w:r>
         <w:rPr>

</xml_diff>

<commit_message>
Fill quotation page numbers and add the two stories as appendices
Cite story quotations by appendix page, correct the detail of the hired
mourner at the mother's funeral, and append transcriptions of both
stories with scan page markers.

Co-Authored-By: Claude Fable 5.1 <noreply@anthropic.com>
Claude-Session: https://claude.ai/code/session_012ZD2wAUBZdU4RRE8wFJx9h
</commit_message>
<xml_diff>
--- a/seminar/סמינריון-פרקים-2-4-ניתוח-הסיפורים.docx
+++ b/seminar/סמינריון-פרקים-2-4-ניתוח-הסיפורים.docx
@@ -538,7 +538,7 @@
           <w:szCs w:val="24"/>
           <w:rtl/>
         </w:rPr>
-        <w:t xml:space="preserve">"האנשים החלולים" הוא סיפור קצר מתוך הקובץ געגועי לקיסינג'ר (קרת, 1994). המספר, גבר בוגר, נזכר בילדותו בבית שבו גדל עם אביו ואמו. אל הבית היו מגיעים אנשים שדפקו על הדלת "בפראות", והאב היה מביט בעינית ואינו פותח. כדי להרגיע את הילד היה האב נשכב לידו על השטיח, נשען בגבו על דופן הפסנתר, מחבק אותו ולוחש שאין ממה לפחד, כי הדופקים הם "האנשים החלולים", קולות בלי גוף. הקולות שבחוץ חזרו על דבריו של האב, הקיפו את הבית וניסו לפתוח את התריסים, והאב והבן הסתתרו בפינה. בהמשך מתה האם, "בלי קול אבל עם גוף", ובלווייתה בכה איש זר שהאב זיהה כאחד מהם. אחר כך מת גם האב, באותה פינה ליד הפסנתר, כשהבן מחבק אותו. בסיום עומד הבן מול הקבר ושותק, "כי בסופו של דבר גם אני, כנראה, הייתי אחד מהם" (קרת, 1994, עמ' __).</w:t>
+        <w:t xml:space="preserve">"האנשים החלולים" הוא סיפור קצר מתוך הקובץ געגועי לקיסינג'ר (קרת, 1994). המספר, גבר בוגר, נזכר בילדותו בבית שבו גדל עם אביו ואמו. אל הבית היו מגיעים אנשים שדפקו על הדלת "בפראות", והאב היה מביט בעינית ואינו פותח. כדי להרגיע את הילד היה האב נשכב לידו על השטיח, נשען בגבו על דופן הפסנתר, מחבק אותו ולוחש שאין ממה לפחד, כי הדופקים הם "האנשים החלולים", קולות בלי גוף. הקולות שבחוץ חזרו על דבריו של האב, הקיפו את הבית וניסו לפתוח את התריסים, והאב והבן הסתתרו בפינה. בהמשך מתה האם, "בלי קול אבל עם גוף", ואל הלוויה הביאו האב והבן איש שיבכה עליה, והאב הראה לבן בספר איזה בכיות יבכה, כי גם האיש הזה היה מהם. אחר כך מת גם האב, באותה פינה ליד הפסנתר, כשהבן מחבק אותו. בסיום עומד הבן מול הקבר ושותק, "כי בסופו של דבר גם אני, כנראה, הייתי אחד מהם" (קרת, 1994, נספח א, עמ' 3).</w:t>
       </w:r>
     </w:p>
     <w:p>
@@ -589,7 +589,7 @@
           <w:szCs w:val="24"/>
           <w:rtl/>
         </w:rPr>
-        <w:t xml:space="preserve">הקושי שבמרכז הסיפור הוא איום מתמשך על הבית. הקולות קוראים בשם: "שיפמן, תפתח את הדלת. אנחנו יודעים שאתה שם" (קרת, 1994, עמ' __). האיום אינו מוסבר, ודווקא לכן הוא מאיים: על פי המודל של לזרוס ופולקמן, לחץ נוצר כאשר האדם מעריך מצב כמסוכן וכעולה על המשאבים העומדים לרשותו, ובשלב ההערכה הראשונית הוא שואל מה עלול לקרות לו (Lazarus &amp; Folkman, 1984). בבית של שיפמן אין תשובה לשאלה הזאת, ולכן הפחד אינו נגמר. הילד מודה בפשטות: "ואני הייתי קצת מפחד מהם".</w:t>
+        <w:t xml:space="preserve">הקושי שבמרכז הסיפור הוא איום מתמשך על הבית. הקולות חוזרים, אחרי לחישתו של האב, על קריאה בשם: "שיפמן, תפתח את הדלת. אנחנו יודעים שאתה שם" (קרת, 1994, נספח א, עמ' 1). האיום אינו מוסבר, ודווקא לכן הוא מאיים: על פי המודל של לזרוס ופולקמן, לחץ נוצר כאשר האדם מעריך מצב כמסוכן וכעולה על המשאבים העומדים לרשותו, ובשלב ההערכה הראשונית הוא שואל מה עלול לקרות לו (Lazarus &amp; Folkman, 1984). בבית של שיפמן אין תשובה לשאלה הזאת, ולכן הפחד אינו נגמר. הילד מודה בפשטות: "ואני הייתי קצת מפחד מהם" (קרת, 1994, נספח א, עמ' 1).</w:t>
       </w:r>
     </w:p>
     <w:p>
@@ -656,23 +656,23 @@
           <w:szCs w:val="24"/>
           <w:rtl/>
         </w:rPr>
-        <w:t xml:space="preserve">הדרך השנייה היא הסבר מחדש של המציאות. "אל תפחד," הוא לוחש, "אין ממה לפחד, זה בסך הכול האנשים החלולים", ובהמשך: "הם אנשים חלולים, בלי גוף, בלי כלום, סתם קולות" (קרת, 1994, עמ' __). זוהי הערכה מחודשת במובן המדויק של המושג: האיום אינו משתנה, אבל המשמעות שלו משתנה, ומי שאין לו גוף אינו יכול לפגוע. שוורץ (Schwartz, 2018) רואה במילה "סתם" מפתח להומור של קרת: היא מרוקנת את הדברים מכובדם ומאפשרת לדמויות לחיות לצד מה שאי אפשר לשנות. האב משתמש במילה הזאת ככלי חינוכי, והילד לומד להשתמש בה בעצמו.</w:t>
-      </w:r>
-    </w:p>
-    <w:p>
-      <w:pPr>
-        <w:bidi/>
-        <w:spacing w:after="120" w:line="360"/>
-        <w:jc w:val="both"/>
-      </w:pPr>
-      <w:r>
-        <w:rPr>
-          <w:rFonts w:ascii="David" w:cs="David" w:eastAsia="David" w:hAnsi="David"/>
-          <w:sz w:val="24"/>
-          <w:szCs w:val="24"/>
-          <w:rtl/>
-        </w:rPr>
-        <w:t xml:space="preserve">הדרך השלישית היא הגוף. האב "נשען עם הגב שלו על דופן הפסנתר ומחבק אותי חזק-חזק", והלחישה נאמרת "באוזן". הוויסות הרגשי אינו נעשה רק במילים אלא במגע, ובמובן זה ההתמודדות היא משותפת: האב מרגיע את הילד, והילד, שנמצא בזרועותיו, מאפשר לאב להיות מי שאינו מפחד. כל שלוש הדרכים שומרות על שני האנשים בחיים ובתוך הבית. אף אחת מהן אינה מוציאה אותם ממנו.</w:t>
+        <w:t xml:space="preserve">הדרך השנייה היא הסבר מחדש של המציאות. "אל תפחד," הוא לוחש, "אין ממה לפחד, זה בסך הכול האנשים החלולים", ובהמשך: "הם אנשים חלולים, בלי גוף, בלי כלום, סתם קולות" (קרת, 1994, נספח א, עמ' 1-2). זוהי הערכה מחודשת במובן המדויק של המושג: האיום אינו משתנה, אבל המשמעות שלו משתנה, ומי שאין לו גוף אינו יכול לפגוע. שוורץ (Schwartz, 2018) רואה במילה "סתם" מפתח להומור של קרת: היא מרוקנת את הדברים מכובדם ומאפשרת לדמויות לחיות לצד מה שאי אפשר לשנות. האב משתמש במילה הזאת ככלי חינוכי, והילד לומד להשתמש בה בעצמו.</w:t>
+      </w:r>
+    </w:p>
+    <w:p>
+      <w:pPr>
+        <w:bidi/>
+        <w:spacing w:after="120" w:line="360"/>
+        <w:jc w:val="both"/>
+      </w:pPr>
+      <w:r>
+        <w:rPr>
+          <w:rFonts w:ascii="David" w:cs="David" w:eastAsia="David" w:hAnsi="David"/>
+          <w:sz w:val="24"/>
+          <w:szCs w:val="24"/>
+          <w:rtl/>
+        </w:rPr>
+        <w:t xml:space="preserve">הדרך השלישית היא הגוף. האב "נשען עם הגב שלו על דופן הפסנתר ומחבק אותי חזק-חזק", והלחישה נאמרת "באוזן" (קרת, 1994, נספח א, עמ' 1). הוויסות הרגשי אינו נעשה רק במילים אלא במגע, ובמובן זה ההתמודדות היא משותפת: האב מרגיע את הילד, והילד, שנמצא בזרועותיו, מאפשר לאב להיות מי שאינו מפחד. כל שלוש הדרכים שומרות על שני האנשים בחיים ובתוך הבית. אף אחת מהן אינה מוציאה אותם ממנו.</w:t>
       </w:r>
     </w:p>
     <w:p>
@@ -707,23 +707,23 @@
           <w:szCs w:val="24"/>
           <w:rtl/>
         </w:rPr>
-        <w:t xml:space="preserve">הלחישה של האב היא גם שיעור. הבן לומד לחזות את הקולות: "ואבא היה ממלמל לי בשקט באוזן והם היו ממלמלים בחוץ אחריו, כמו הד", ובהמשך "לפעמים אבא היה אומר את מה שיגידו ולפעמים אני" (קרת, 1994, עמ' __). נוצרת שרשרת של הדים: הקולות חוזרים על האב, הבן חוזר על האב, ובסוף הבן חוזר על הקולות. ההתמודדות עוברת מדור לדור באותה דרך שבה עובר הפחד.</w:t>
-      </w:r>
-    </w:p>
-    <w:p>
-      <w:pPr>
-        <w:bidi/>
-        <w:spacing w:after="120" w:line="360"/>
-        <w:jc w:val="both"/>
-      </w:pPr>
-      <w:r>
-        <w:rPr>
-          <w:rFonts w:ascii="David" w:cs="David" w:eastAsia="David" w:hAnsi="David"/>
-          <w:sz w:val="24"/>
-          <w:szCs w:val="24"/>
-          <w:rtl/>
-        </w:rPr>
-        <w:t xml:space="preserve">הדפוס הזה מוכר ממחקרים על הדור השני והשלישי לשואה בכתיבתו של קרת. אומר-שרמן מראה כיצד סיפורי ההורים בבית של קרת הפכו לחומר שממנו נבנית הזהות של הבן, וכיצד ההומור והפנטזיה משמשים את הבן כדי לשאת את מה שקיבל (Omer-Sherman, 2020). אברמוביץ' מוסיף שגיבוריו הצעירים של קרת יורשים לא רק זיכרון אלא גם תחושת אשמה כלפי הדור שקדם להם, ושהסיפורים מפרקים את הזיכרון הרשמי לטובת זיכרון פרטי ומבולבל (Abramovich, 2019). ב"האנשים החלולים" האשמה מופיעה בעדינות. המספר הבוגר מתפלא "על זה שפעם פחדתי כל-כך", כאילו הפחד היה חולשה שיש להתבייש בה, ובסיום הוא שותק על הקבר. השתיקה היא גם חרטה: הבן שהאב חיבק "כשעוד פחדתי" לא הצליח להשיב לאב את מה שקיבל ממנו.</w:t>
+        <w:t xml:space="preserve">הלחישה של האב היא גם שיעור. הבן לומד לחזות את הקולות: "ואבא היה ממלמל לי בשקט באוזן והם היו ממלמלים בחוץ אחריו, כמו הד", ובהמשך "לפעמים אבא היה אומר את מה שיגידו ולפעמים אני" (קרת, 1994, נספח א, עמ' 1-2). נוצרת שרשרת של הדים: הקולות חוזרים על האב, הבן חוזר על האב, ובסוף הבן חוזר על הקולות. ההתמודדות עוברת מדור לדור באותה דרך שבה עובר הפחד.</w:t>
+      </w:r>
+    </w:p>
+    <w:p>
+      <w:pPr>
+        <w:bidi/>
+        <w:spacing w:after="120" w:line="360"/>
+        <w:jc w:val="both"/>
+      </w:pPr>
+      <w:r>
+        <w:rPr>
+          <w:rFonts w:ascii="David" w:cs="David" w:eastAsia="David" w:hAnsi="David"/>
+          <w:sz w:val="24"/>
+          <w:szCs w:val="24"/>
+          <w:rtl/>
+        </w:rPr>
+        <w:t xml:space="preserve">הדפוס הזה מוכר ממחקרים על הדור השני והשלישי לשואה בכתיבתו של קרת. אומר-שרמן מראה כיצד סיפורי ההורים בבית של קרת הפכו לחומר שממנו נבנית הזהות של הבן, וכיצד ההומור והפנטזיה משמשים את הבן כדי לשאת את מה שקיבל (Omer-Sherman, 2020). אברמוביץ' מוסיף שגיבוריו הצעירים של קרת יורשים לא רק זיכרון אלא גם תחושת אשמה כלפי הדור שקדם להם, ושהסיפורים מפרקים את הזיכרון הרשמי לטובת זיכרון פרטי ומבולבל (Abramovich, 2019). ב"האנשים החלולים" האשמה מופיעה בעדינות. המספר הבוגר מתפלא "על זה שפעם פחדתי כל-כך" (קרת, 1994, נספח א, עמ' 2), כאילו הפחד היה חולשה שיש להתבייש בה, ובסיום הוא שותק על הקבר. השתיקה היא גם חרטה: הבן שהאב חיבק "כשעוד פחדתי" לא הצליח להשיב לאב את מה שקיבל ממנו.</w:t>
       </w:r>
     </w:p>
     <w:p>
@@ -758,23 +758,23 @@
           <w:szCs w:val="24"/>
           <w:rtl/>
         </w:rPr>
-        <w:t xml:space="preserve">מותה של האם מתואר במשפט אחד: "ואמא מתה בלי קול אבל עם גוף, והלכנו לקבור אותה" (קרת, 1994, עמ' __). האב מתמודד עם האובדן באותה שיטה שבה התמודד עם הקולות: הוא ממיין. את האיש הזר שבוכה על הקבר הוא מזהה, "בדיוק איזה בכיות", כאחד מהם, ומראה לבן בספר. גם האבל מקבל חוקים, וגם הבכי של הזר נעשה "סתם קולות". רובין מתאר את האבל כתהליך הנע בשני מסלולים: מסלול התפקוד, שבו האדם ממשיך לחיות ולעשות, ומסלול הקשר עם המת, שנמשך גם אחרי המוות (Rubin, 1999). בבית של שיפמן מסלול התפקוד נשמר בקפדנות (קוברים, שותקים, חוזרים לפינה), ומסלול הקשר עם האם אינו מופיע כלל. האם נעלמת מן הסיפור כשם שנעלמה ממנו בחייה.</w:t>
-      </w:r>
-    </w:p>
-    <w:p>
-      <w:pPr>
-        <w:bidi/>
-        <w:spacing w:after="120" w:line="360"/>
-        <w:jc w:val="both"/>
-      </w:pPr>
-      <w:r>
-        <w:rPr>
-          <w:rFonts w:ascii="David" w:cs="David" w:eastAsia="David" w:hAnsi="David"/>
-          <w:sz w:val="24"/>
-          <w:szCs w:val="24"/>
-          <w:rtl/>
-        </w:rPr>
-        <w:t xml:space="preserve">מות האב הוא רגע היפוך. הוא מת "בפינה שם ליד הפסנתר, כשאני מחבק אותו את החיבוק שהיה מחבק אותי כשעוד פחדתי" (קרת, 1994, עמ' __). הבן נעשה למחבק, והאב למי שאינו עונה. על הקבר חוזר הטקס של האם: איש בוכה "את הבכיות שידעתי שיבכה מהספר", והאב שותק. ואז: "ואני שתקתי אחריו". השתיקה של הבן היא הד לשתיקת האב, כפי שהמילים היו הד ללחישה. במונחיו של רובין, הבן ממשיך את הקשר עם האב המת בדרך היחידה שלמד: לחזור אחריו. כהן (2015) מראה שאחרי מות של בן משפחה, כל אחד מבני המשפחה נע על ציר אבל משלו, ושהתקשורת ביניהם נפגעת. בסיפור של קרת התקשורת מתפוררת עד לשתיקה גמורה, כי אין עוד עם מי לדבר.</w:t>
+        <w:t xml:space="preserve">מותה של האם מתואר במשפט אחד: "ואמא מתה בלי קול אבל עם גוף, והלכנו לקבור אותה" (קרת, 1994, נספח א, עמ' 2). האב מתמודד עם האובדן באותה שיטה שבה התמודד עם הקולות: הוא ממיין. אל הלוויה מביאים האב והבן "איש שיבכה עליה", והאב מראה לבן בספר "בדיוק איזה בכיות", כי גם האיש הזה "היה מהם" (קרת, 1994, נספח א, עמ' 2). הבכי על האם אינו נעשה בידי המשפחה אלא מוזמן מבחוץ, מאחד החלולים, לפי הספר. גם האבל מקבל חוקים, וגם הוא נעשה "סתם קולות". רובין מתאר את האבל כתהליך הנע בשני מסלולים: מסלול התפקוד, שבו האדם ממשיך לחיות ולעשות, ומסלול הקשר עם המת, שנמשך גם אחרי המוות (Rubin, 1999). בבית של שיפמן מסלול התפקוד נשמר בקפדנות (קוברים, שותקים, חוזרים לפינה), ומסלול הקשר עם האם אינו מופיע כלל. האם נעלמת מן הסיפור כשם שנעלמה ממנו בחייה.</w:t>
+      </w:r>
+    </w:p>
+    <w:p>
+      <w:pPr>
+        <w:bidi/>
+        <w:spacing w:after="120" w:line="360"/>
+        <w:jc w:val="both"/>
+      </w:pPr>
+      <w:r>
+        <w:rPr>
+          <w:rFonts w:ascii="David" w:cs="David" w:eastAsia="David" w:hAnsi="David"/>
+          <w:sz w:val="24"/>
+          <w:szCs w:val="24"/>
+          <w:rtl/>
+        </w:rPr>
+        <w:t xml:space="preserve">מות האב הוא רגע היפוך. הוא מת "בפינה שם ליד הפסנתר, כשאני מחבק אותו את החיבוק שהיה מחבק אותי כשעוד פחדתי" (קרת, 1994, נספח א, עמ' 2). הבן נעשה למחבק, והאב למי שאינו עונה. על הקבר חוזר הטקס של האם: איש בוכה "את הבכיות שידעתי שיבכה מהספר", והאב שותק. ואז: "ואני שתקתי אחריו" (קרת, 1994, נספח א, עמ' 2-3). השתיקה של הבן היא הד לשתיקת האב, כפי שהמילים היו הד ללחישה. במונחיו של רובין, הבן ממשיך את הקשר עם האב המת בדרך היחידה שלמד: לחזור אחריו. כהן (2015) מראה שאחרי מות של בן משפחה, כל אחד מבני המשפחה נע על ציר אבל משלו, ושהתקשורת ביניהם נפגעת. בסיפור של קרת התקשורת מתפוררת עד לשתיקה גמורה, כי אין עוד עם מי לדבר.</w:t>
       </w:r>
     </w:p>
     <w:p>
@@ -809,7 +809,7 @@
           <w:szCs w:val="24"/>
           <w:rtl/>
         </w:rPr>
-        <w:t xml:space="preserve">המספר הבוגר מסכם את מה שנותר לו מן השיטה של אביו: "והיום המלים שלי חוזרות מהם כמו כדור טניס שזרקתי על קיר. סתם, ממש סתם" (קרת, 1994, עמ' __). המילים שהיו אמורות להגן חוזרות ריקות. הכפלת המילה "סתם" מדגישה שהריקון פועל לשני הכיוונים: האב רוקן את הקולות מגוף, והבן התרוקן בעצמו.</w:t>
+        <w:t xml:space="preserve">המספר הבוגר מסכם את מה שנותר לו מן השיטה של אביו: "והיום המלים שלי חוזרות מהם כמו כדור טניס שזרקתי על קיר. סתם, ממש סתם" (קרת, 1994, נספח א, עמ' 2). המילים שהיו אמורות להגן חוזרות ריקות. הכפלת המילה "סתם" מדגישה שהריקון פועל לשני הכיוונים: האב רוקן את הקולות מגוף, והבן התרוקן בעצמו.</w:t>
       </w:r>
     </w:p>
     <w:p>
@@ -884,7 +884,7 @@
           <w:szCs w:val="24"/>
           <w:rtl/>
         </w:rPr>
-        <w:t xml:space="preserve">"מי כמונו יודע" נדפס בקובץ אוטוקורקט (קרת, 2024), שלושים שנה אחרי געגועי לקיסינג'ר. המספר, סופר, יושב בבית קפה מול סופר אמריקאי "שלא הפסיק לדבר". האמריקאי כתב שלושה ספרים, אחד מהם זכה בפרס בין-לאומי "שלא שמעתי עליו מעולם", וכל משפט שני שלו נפתח במילים "ומי כמונו יודע". הוא מספר על חייו: לימודי כתיבה במערב התיכון, משפחה, ילד שנהרג בתאונת דרכים, גירושים, גיור, התפקרות והצטרפות לתנועה עולמית של מינימליזם. ברשותו שני זוגות תחתונים ועט אחד. המספר, שכותב במחשב ושיש לו לפחות עשרים זוגות תחתונים, מסתיר את שני הדברים. האמריקאי מפנה את תשומת לבו לשקיעה שמאחורי כתפו, מכריז שהם "בני מזל" כי הכתיבה מאפשרת להם לשמר את היופי לנצח, ומודיע שיכתוב על השקיעה הזאת. המספר, שצווארו כבר כואב, אומר "גם אני", ויודע שהסיפור הבא שלו "הולך להיות על מישהו שנתפס לו הצוואר" (קרת, 2024, עמ' __).</w:t>
+        <w:t xml:space="preserve">"מי כמונו יודע" נדפס בקובץ אוטוקורקט (קרת, 2024), שלושים שנה אחרי געגועי לקיסינג'ר. המספר, סופר, יושב בבית קפה מול סופר אמריקאי "שלא הפסיק לדבר". האמריקאי כתב שלושה ספרים, אחד מהם זכה בפרס בין-לאומי "שלא שמעתי עליו מעולם", וכל משפט שני שלו נפתח במילים "ומי כמונו יודע". הוא מספר על חייו: לימודי כתיבה במערב התיכון, משפחה, ילד שנהרג בתאונת דרכים, גירושים, גיור, התפקרות והצטרפות לתנועה עולמית של מינימליזם. ברשותו שני זוגות תחתונים ועט אחד. המספר, שכותב במחשב ושיש לו לפחות עשרים זוגות תחתונים, מסתיר את שני הדברים. האמריקאי מפנה את תשומת לבו לשקיעה שמאחורי כתפו, מכריז שהם "בני מזל" כי הכתיבה מאפשרת להם לשמר את היופי לנצח, ומודיע שיכתוב על השקיעה הזאת. המספר, שצווארו כבר כואב, אומר "גם אני", ויודע שהסיפור הבא שלו "הולך להיות על מישהו שנתפס לו הצוואר" (קרת, 2024, נספח ב, עמ' 3).</w:t>
       </w:r>
     </w:p>
     <w:p>
@@ -1003,23 +1003,23 @@
           <w:szCs w:val="24"/>
           <w:rtl/>
         </w:rPr>
-        <w:t xml:space="preserve">זה גרם לי להרגיש כאילו אנחנו ישות אחת, תאומים סיאמיים שאמנם יכולים לנופף עצמאית, כל אחד בזרועותיו שלו, אבל חולקים לב אחד גדול וכואב שפועם כמו מטרונום ענקי שרק הוא ואני יכולים לשמוע (קרת, 2024, עמ' __).</w:t>
-      </w:r>
-    </w:p>
-    <w:p>
-      <w:pPr>
-        <w:bidi/>
-        <w:spacing w:after="120" w:line="360"/>
-        <w:jc w:val="both"/>
-      </w:pPr>
-      <w:r>
-        <w:rPr>
-          <w:rFonts w:ascii="David" w:cs="David" w:eastAsia="David" w:hAnsi="David"/>
-          <w:sz w:val="24"/>
-          <w:szCs w:val="24"/>
-          <w:rtl/>
-        </w:rPr>
-        <w:t xml:space="preserve">הדימוי מתאר שייכות כפויה. הלב המשותף "כואב", והמטרונום, מכשיר שקובע קצב, נשמע רק לשניהם. הדיבור הבלתי פוסק הוא ויסות רגשי: האמריקאי מדבר "כאילו יש לו יותר מדי דברים להגיד והוא חייב להספיק את כולם", ומי שחייב להספיק פוחד שייגמר לו הזמן. לזרוס ופולקמן מונים את חיפוש התמיכה החברתית בין דרכי ההתמודדות ממוקדות הרגש (Lazarus &amp; Folkman, 1984). כאן התמיכה אינה מתבקשת אלא נלקחת. קצמן (2005) מתאר את דמויותיו של קרת כמי שמתגעגעות למיתוס, לסיפור גדול שיעניק לחייהן סדר. הנוסחה "ומי כמונו יודע" היא ניסיון לייצר מיתוס כזה בזמן אמת: שני סופרים, לב אחד, ידיעה שאין לאחרים.</w:t>
+        <w:t xml:space="preserve">זה גרם לי להרגיש כאילו אנחנו ישות אחת, תאומים סיאמיים שאמנם יכולים לנופף עצמאית, כל אחד בזרועותיו שלו, אבל חולקים לב אחד גדול וכואב שפועם כמו מטרונום ענקי שרק הוא ואני יכולים לשמוע (קרת, 2024, נספח ב, עמ' 1).</w:t>
+      </w:r>
+    </w:p>
+    <w:p>
+      <w:pPr>
+        <w:bidi/>
+        <w:spacing w:after="120" w:line="360"/>
+        <w:jc w:val="both"/>
+      </w:pPr>
+      <w:r>
+        <w:rPr>
+          <w:rFonts w:ascii="David" w:cs="David" w:eastAsia="David" w:hAnsi="David"/>
+          <w:sz w:val="24"/>
+          <w:szCs w:val="24"/>
+          <w:rtl/>
+        </w:rPr>
+        <w:t xml:space="preserve">הדימוי מתאר שייכות כפויה. הלב המשותף "כואב", והמטרונום, מכשיר שקובע קצב, נשמע רק לשניהם. הדיבור הבלתי פוסק הוא ויסות רגשי: האמריקאי מדבר "כאילו יש לו יותר מדי דברים להגיד והוא חייב להספיק את כולם" (קרת, 2024, נספח ב, עמ' 1), ומי שחייב להספיק פוחד שייגמר לו הזמן. לזרוס ופולקמן מונים את חיפוש התמיכה החברתית בין דרכי ההתמודדות ממוקדות הרגש (Lazarus &amp; Folkman, 1984). כאן התמיכה אינה מתבקשת אלא נלקחת. קצמן (2005) מתאר את דמויותיו של קרת כמי שמתגעגעות למיתוס, לסיפור גדול שיעניק לחייהן סדר. הנוסחה "ומי כמונו יודע" היא ניסיון לייצר מיתוס כזה בזמן אמת: שני סופרים, לב אחד, ידיעה שאין לאחרים.</w:t>
       </w:r>
     </w:p>
     <w:p>
@@ -1054,7 +1054,7 @@
           <w:szCs w:val="24"/>
           <w:rtl/>
         </w:rPr>
-        <w:t xml:space="preserve">רשימת האירועים בחיי האמריקאי מגלה דפוס: אחרי האובדן הוא מחליף מסגרת אחרי מסגרת. גיור, התפקרות, תנועה עולמית. כל מסגרת מציעה חוקים חדשים, והמינימליזם מציע את החוקים הפשוטים ביותר: שני זוגות תחתונים, עט אחד. הוא מסביר בגאווה: "בנאדם צריך תמיד שיהיה לו עוד זוג תחתונים, להחלפה, אבל עט? אחד זה די והותר" (קרת, 2024, עמ' __). ההומור של המשפט, שבו קרץ האמריקאי למספר, הוא מסוג ההומור ששוורץ (Schwartz, 2018) מזהה אצל קרת: צחוק שאינו מבטל את הכאב אלא מאפשר לחיות לידו.</w:t>
+        <w:t xml:space="preserve">רשימת האירועים בחיי האמריקאי מגלה דפוס: אחרי האובדן הוא מחליף מסגרת אחרי מסגרת. גיור, התפקרות, תנועה עולמית. כל מסגרת מציעה חוקים חדשים, והמינימליזם מציע את החוקים הפשוטים ביותר: שני זוגות תחתונים, עט אחד. הוא מסביר בגאווה: "בנאדם צריך תמיד שיהיה לו עוד זוג תחתונים, להחלפה, אבל עט? אחד זה די והותר" (קרת, 2024, נספח ב, עמ' 2). ההומור של המשפט, שבו קרץ האמריקאי למספר, הוא מסוג ההומור ששוורץ (Schwartz, 2018) מזהה אצל קרת: צחוק שאינו מבטל את הכאב אלא מאפשר לחיות לידו.</w:t>
       </w:r>
     </w:p>
     <w:p>
@@ -1105,23 +1105,23 @@
           <w:szCs w:val="24"/>
           <w:rtl/>
         </w:rPr>
-        <w:t xml:space="preserve">דרך ההתמודדות של המספר שונה. כשהאמריקאי שואל "כמה זוגות תחתונים יש לך בארון?", המספר משיב שאינו זוכר: "ידעתי שיש לי לפחות עשרים, אבל פחדתי להעלות את זה. פחדתי שזה ירחיק בינינו" (קרת, 2024, עמ' __). השקר הקטן נועד לשמור על ה"אנחנו". המספר מעדיף קרבה מזויפת על אמת מרחיקה, ובכך הוא מאשר את הנוסחה של האמריקאי בלי להאמין בה.</w:t>
-      </w:r>
-    </w:p>
-    <w:p>
-      <w:pPr>
-        <w:bidi/>
-        <w:spacing w:after="120" w:line="360"/>
-        <w:jc w:val="both"/>
-      </w:pPr>
-      <w:r>
-        <w:rPr>
-          <w:rFonts w:ascii="David" w:cs="David" w:eastAsia="David" w:hAnsi="David"/>
-          <w:sz w:val="24"/>
-          <w:szCs w:val="24"/>
-          <w:rtl/>
-        </w:rPr>
-        <w:t xml:space="preserve">כשהאמריקאי מצביע על השקיעה, המספר מסתובב "מתוך נימוס". השקיעה יפה, "אבל הצוואר שלי התחיל לכאוב". הגוף משלם את מחיר ההסכמה. במונחי לזרוס ופולקמן (Lazarus &amp; Folkman, 1984) זו הימנעות מעימות, ומחירה מופיע לא ברגש אלא בשריר. יש כאן היפוך של הסיפור המוקדם. האב ב"האנשים החלולים" סוגר את הדלת בפני הזרים ומגן על גופו של הבן בחיבוק. המספר ב"מי כמונו יודע" פותח את עצמו לזר ומסובב את צווארו לפי דרישתו. בשני המקרים ההתמודדות שומרת על הקשר, ובשני המקרים היא גובה משהו מן העצמי.</w:t>
+        <w:t xml:space="preserve">דרך ההתמודדות של המספר שונה. כשהאמריקאי שואל "כמה זוגות תחתונים יש לך בארון?", המספר משיב שאינו זוכר: "ידעתי שיש לי לפחות עשרים, אבל פחדתי להעלות את זה. פחדתי שזה ירחיק בינינו" (קרת, 2024, נספח ב, עמ' 2-3). השקר הקטן נועד לשמור על ה"אנחנו". המספר מעדיף קרבה מזויפת על אמת מרחיקה, ובכך הוא מאשר את הנוסחה של האמריקאי בלי להאמין בה.</w:t>
+      </w:r>
+    </w:p>
+    <w:p>
+      <w:pPr>
+        <w:bidi/>
+        <w:spacing w:after="120" w:line="360"/>
+        <w:jc w:val="both"/>
+      </w:pPr>
+      <w:r>
+        <w:rPr>
+          <w:rFonts w:ascii="David" w:cs="David" w:eastAsia="David" w:hAnsi="David"/>
+          <w:sz w:val="24"/>
+          <w:szCs w:val="24"/>
+          <w:rtl/>
+        </w:rPr>
+        <w:t xml:space="preserve">כשהאמריקאי מצביע על השקיעה, המספר מסתובב "מתוך נימוס". השקיעה יפה, "אבל הצוואר שלי התחיל לכאוב" (קרת, 2024, נספח ב, עמ' 3). הגוף משלם את מחיר ההסכמה. במונחי לזרוס ופולקמן (Lazarus &amp; Folkman, 1984) זו הימנעות מעימות, ומחירה מופיע לא ברגש אלא בשריר. יש כאן היפוך של הסיפור המוקדם. האב ב"האנשים החלולים" סוגר את הדלת בפני הזרים ומגן על גופו של הבן בחיבוק. המספר ב"מי כמונו יודע" פותח את עצמו לזר ומסובב את צווארו לפי דרישתו. בשני המקרים ההתמודדות שומרת על הקשר, ובשני המקרים היא גובה משהו מן העצמי.</w:t>
       </w:r>
     </w:p>
     <w:p>
@@ -1156,23 +1156,23 @@
           <w:szCs w:val="24"/>
           <w:rtl/>
         </w:rPr>
-        <w:t xml:space="preserve">האמריקאי אומר שני דברים סותרים על הכתיבה. בתחילה הוא טוען ש"יצירה היא בסך הכל פעולת הסחה. מראית עין של מציאות קרנבלית רוחשת שאמורה להסיח את דעתנו מהמציאות האמיתית הקרה, המאכזבת ונטולת הנשמה" (קרת, 2024, עמ' __). בהמשך, מול השקיעה, הוא טוען שהכתיבה מאפשרת "לשמר את היופי הזה לנצח". פעם הכתיבה בורחת מן המציאות, ופעם היא שומרת אותה. שתי הטענות הן דרכי התמודדות של אדם שהמציאות שלו הייתה "קרה ומאכזבת" באמת. קצמן (2005) קורא את כתיבתו של קרת כמיתופואסיס, יצירה של סיפורים קטנים שמעניקים לחיים סדר, ובסיפור הזה קרת מניח את הרעיון בפיה של דמות שמאמינה בו בכל לבה. המספר אינו מתווכח. הוא מהנהן, ואפילו חושב ש"אולי באמת עדיף לכתוב בעט".</w:t>
-      </w:r>
-    </w:p>
-    <w:p>
-      <w:pPr>
-        <w:bidi/>
-        <w:spacing w:after="120" w:line="360"/>
-        <w:jc w:val="both"/>
-      </w:pPr>
-      <w:r>
-        <w:rPr>
-          <w:rFonts w:ascii="David" w:cs="David" w:eastAsia="David" w:hAnsi="David"/>
-          <w:sz w:val="24"/>
-          <w:szCs w:val="24"/>
-          <w:rtl/>
-        </w:rPr>
-        <w:t xml:space="preserve">אבל טון הדיבור חושף את מה שמסתתר מאחורי התאוריה. "אני הולך לכתוב על השקיעה הזאת," אומר האמריקאי "בטון נחוש שנשמע כמעט כמו איום". הכתיבה נעשית תחרות ושליטה, ולא רק נחמה. מי שאיבד הכול רוצה להיות לפחות זה שמחזיק את השקיעה.</w:t>
+        <w:t xml:space="preserve">האמריקאי אומר שני דברים סותרים על הכתיבה. בתחילה הוא טוען ש"יצירה היא בסך הכל פעולת הסחה. מראית עין של מציאות קרנבלית רוחשת שאמורה להסיח את דעתנו מהמציאות האמיתית הקרה, המאכזבת ונטולת הנשמה" (קרת, 2024, נספח ב, עמ' 1-2). בהמשך, מול השקיעה, הוא טוען שהכתיבה מאפשרת "לשמר את היופי הזה לנצח" (קרת, 2024, נספח ב, עמ' 3). פעם הכתיבה בורחת מן המציאות, ופעם היא שומרת אותה. שתי הטענות הן דרכי התמודדות של אדם שהמציאות שלו הייתה "קרה ומאכזבת" באמת. קצמן (2005) קורא את כתיבתו של קרת כמיתופואסיס, יצירה של סיפורים קטנים שמעניקים לחיים סדר, ובסיפור הזה קרת מניח את הרעיון בפיה של דמות שמאמינה בו בכל לבה. המספר אינו מתווכח. הוא מהנהן, ואפילו חושב ש"אולי באמת עדיף לכתוב בעט".</w:t>
+      </w:r>
+    </w:p>
+    <w:p>
+      <w:pPr>
+        <w:bidi/>
+        <w:spacing w:after="120" w:line="360"/>
+        <w:jc w:val="both"/>
+      </w:pPr>
+      <w:r>
+        <w:rPr>
+          <w:rFonts w:ascii="David" w:cs="David" w:eastAsia="David" w:hAnsi="David"/>
+          <w:sz w:val="24"/>
+          <w:szCs w:val="24"/>
+          <w:rtl/>
+        </w:rPr>
+        <w:t xml:space="preserve">אבל טון הדיבור חושף את מה שמסתתר מאחורי התאוריה. "אני הולך לכתוב על השקיעה הזאת," אומר האמריקאי "בטון נחוש שנשמע כמעט כמו איום" (קרת, 2024, נספח ב, עמ' 3). הכתיבה נעשית תחרות ושליטה, ולא רק נחמה. מי שאיבד הכול רוצה להיות לפחות זה שמחזיק את השקיעה.</w:t>
       </w:r>
     </w:p>
     <w:p>
@@ -1207,7 +1207,7 @@
           <w:szCs w:val="24"/>
           <w:rtl/>
         </w:rPr>
-        <w:t xml:space="preserve">הסיפור מסתיים בשני משפטים: "'גם אני,' אמרתי, 'גם אני.' כבר אז ידעתי שהסיפור הבא שלי הולך להיות על מישהו שנתפס לו הצוואר" (קרת, 2024, עמ' __). המספר מסכים בקול וחולק בכתב. הוא לא יכתוב על הנשגב אלא על הכאב הקטן, לא על השקיעה אלא על השריר שנתפס בגלל השקיעה. שוורץ (Schwartz, 2018) מתאר את ההומור של קרת כחשיבה שאינה קורבנית: הדמות אינה מתלוננת ואינה נכנעת, אלא מוצאת מה אפשר לעשות עם המצב. כאן המספר עושה מן המפגש סיפור, וזה הסיפור שאנחנו קוראים. ה"אנחנו" של האמריקאי נשבר בשקט, בלי שהאמריקאי ידע.</w:t>
+        <w:t xml:space="preserve">הסיפור מסתיים בשני משפטים: "'גם אני,' אמרתי, 'גם אני.' כבר אז ידעתי שהסיפור הבא שלי הולך להיות על מישהו שנתפס לו הצוואר" (קרת, 2024, נספח ב, עמ' 3). המספר מסכים בקול וחולק בכתב. הוא לא יכתוב על הנשגב אלא על הכאב הקטן, לא על השקיעה אלא על השריר שנתפס בגלל השקיעה. שוורץ (Schwartz, 2018) מתאר את ההומור של קרת כחשיבה שאינה קורבנית: הדמות אינה מתלוננת ואינה נכנעת, אלא מוצאת מה אפשר לעשות עם המצב. כאן המספר עושה מן המפגש סיפור, וזה הסיפור שאנחנו קוראים. ה"אנחנו" של האמריקאי נשבר בשקט, בלי שהאמריקאי ידע.</w:t>
       </w:r>
     </w:p>
     <w:p>
@@ -1384,7 +1384,7 @@
           <w:szCs w:val="24"/>
           <w:rtl/>
         </w:rPr>
-        <w:t xml:space="preserve">בשני הסיפורים המספר נשמע בקולו שלו רק בסיום. הילד: "ואני שתקתי אחריו כי בסופו של דבר גם אני, כנראה, הייתי אחד מהם". המבוגר: "כבר אז ידעתי שהסיפור הבא שלי הולך להיות על מישהו שנתפס לו הצוואר". שני הסיומים הם וידוי, ובשניהם יש מידה של אשמה. הילד מודה שהוא חלול, כלומר שלא הצליח להיות מה שאביו ניסה להגן עליו שיהיה. המבוגר מודה שהסכים בפה ולא בלב, ושהסיפור שלו יבגוד באיש שקרא לו "אחי" בכל משפט שני. אברמוביץ' (Abramovich, 2019) מראה שהאשמה אצל גיבוריו הצעירים של קרת נקשרת לדברים יומיומיים ולא למעשים גדולים, ושני הסיומים מאשרים זאת.</w:t>
+        <w:t xml:space="preserve">בשני הסיפורים המספר נשמע בקולו שלו רק בסיום. הילד: "ואני שתקתי אחריו כי בסופו של דבר גם אני, כנראה, הייתי אחד מהם" (קרת, 1994, נספח א, עמ' 2-3). המבוגר: "כבר אז ידעתי שהסיפור הבא שלי הולך להיות על מישהו שנתפס לו הצוואר" (קרת, 2024, נספח ב, עמ' 3). שני הסיומים הם וידוי, ובשניהם יש מידה של אשמה. הילד מודה שהוא חלול, כלומר שלא הצליח להיות מה שאביו ניסה להגן עליו שיהיה. המבוגר מודה שהסכים בפה ולא בלב, ושהסיפור שלו יבגוד באיש שקרא לו "אחי" בכל משפט שני. אברמוביץ' (Abramovich, 2019) מראה שהאשמה אצל גיבוריו הצעירים של קרת נקשרת לדברים יומיומיים ולא למעשים גדולים, ושני הסיומים מאשרים זאת.</w:t>
       </w:r>
     </w:p>
     <w:p>
@@ -2520,6 +2520,347 @@
         <w:t xml:space="preserve">, Winter 2018. https://www.bgu.ac.il/media/zpjot1iw/yigal-schwartz-bgur.pdf</w:t>
       </w:r>
     </w:p>
+    <w:p>
+      <w:r>
+        <w:br w:type="page"/>
+      </w:r>
+    </w:p>
+    <w:p>
+      <w:pPr>
+        <w:pStyle w:val="Heading1"/>
+        <w:bidi/>
+        <w:spacing w:after="200" w:before="360" w:line="360"/>
+        <w:jc w:val="right"/>
+      </w:pPr>
+      <w:r>
+        <w:rPr>
+          <w:rFonts w:ascii="David" w:cs="David" w:eastAsia="David" w:hAnsi="David"/>
+          <w:b/>
+          <w:bCs/>
+          <w:sz w:val="32"/>
+          <w:szCs w:val="32"/>
+          <w:rtl/>
+        </w:rPr>
+        <w:t xml:space="preserve">נספחים</w:t>
+      </w:r>
+    </w:p>
+    <w:p>
+      <w:pPr>
+        <w:bidi/>
+        <w:spacing w:after="120" w:line="360"/>
+        <w:jc w:val="both"/>
+      </w:pPr>
+      <w:r>
+        <w:rPr>
+          <w:rFonts w:ascii="David" w:cs="David" w:eastAsia="David" w:hAnsi="David"/>
+          <w:sz w:val="24"/>
+          <w:szCs w:val="24"/>
+          <w:rtl/>
+        </w:rPr>
+        <w:t xml:space="preserve">להלן נוסח שני הסיפורים כפי שהוא מופיע בקובץ הסרוק. מספרי העמודים בסוגריים הם מספרי העמודים של הסריקה, והם אלה שאליהם מפנים הציטוטים בגוף העבודה.</w:t>
+      </w:r>
+    </w:p>
+    <w:p>
+      <w:pPr>
+        <w:pStyle w:val="Heading2"/>
+        <w:bidi/>
+        <w:spacing w:after="120" w:before="240" w:line="360"/>
+        <w:jc w:val="right"/>
+      </w:pPr>
+      <w:r>
+        <w:rPr>
+          <w:rFonts w:ascii="David" w:cs="David" w:eastAsia="David" w:hAnsi="David"/>
+          <w:b/>
+          <w:bCs/>
+          <w:sz w:val="28"/>
+          <w:szCs w:val="28"/>
+          <w:rtl/>
+        </w:rPr>
+        <w:t xml:space="preserve">נספח א: "האנשים החלולים" (מתוך געגועי לקיסינג'ר, 1994)</w:t>
+      </w:r>
+    </w:p>
+    <w:p>
+      <w:pPr>
+        <w:bidi/>
+        <w:spacing w:after="60" w:before="160" w:line="360"/>
+        <w:jc w:val="right"/>
+      </w:pPr>
+      <w:r>
+        <w:rPr>
+          <w:rFonts w:ascii="David" w:cs="David" w:eastAsia="David" w:hAnsi="David"/>
+          <w:b/>
+          <w:bCs/>
+          <w:color w:val="555555"/>
+          <w:sz w:val="20"/>
+          <w:szCs w:val="20"/>
+          <w:rtl/>
+        </w:rPr>
+        <w:t xml:space="preserve">[עמ' 1]</w:t>
+      </w:r>
+    </w:p>
+    <w:p>
+      <w:pPr>
+        <w:bidi/>
+        <w:spacing w:after="120" w:line="360"/>
+        <w:jc w:val="both"/>
+      </w:pPr>
+      <w:r>
+        <w:rPr>
+          <w:rFonts w:ascii="David" w:cs="David" w:eastAsia="David" w:hAnsi="David"/>
+          <w:sz w:val="24"/>
+          <w:szCs w:val="24"/>
+          <w:rtl/>
+        </w:rPr>
+        <w:t xml:space="preserve">כשהייתי ילד היו באים אלינו כל מיני אנשים הביתה ודופקים בדלת. אבא היה מסתכל בחור של העינית אבל לא פותח. והם היו דופקים על הדלת, דופקים בפראות, ואני הייתי קצת מפחד מהם. אבל אבא היה תמיד ניגש אלי ונשכב לידי על השטיח, נשען עם הגב שלו על דופן הפסנתר ומחבק אותי חזק-חזק. "אל תפחד," היה לוחש, "אין ממה לפחד, זה בסך הכול האנשים החלולים." ואבא היה לוחש לי באוזן, "שיפמן, תפתח את הדלת. אנחנו יודעים שאתה שם," והאנשים היו חוזרים אחרי שנייה על הדברים של אבא, רק בקול. ואז הם היו מקיפים את הבית כמה פעמים, מנסים לפתוח את התריסים מבחוץ, ואבא היה ממלמל לי בשקט באוזן והם היו ממלמלים בחוץ אחריו, כמו הד. "אתה רואה," היה ממשיך אבא ללחוש, "אין ממה לפחד. הם אנשים</w:t>
+      </w:r>
+    </w:p>
+    <w:p>
+      <w:pPr>
+        <w:bidi/>
+        <w:spacing w:after="60" w:before="160" w:line="360"/>
+        <w:jc w:val="right"/>
+      </w:pPr>
+      <w:r>
+        <w:rPr>
+          <w:rFonts w:ascii="David" w:cs="David" w:eastAsia="David" w:hAnsi="David"/>
+          <w:b/>
+          <w:bCs/>
+          <w:color w:val="555555"/>
+          <w:sz w:val="20"/>
+          <w:szCs w:val="20"/>
+          <w:rtl/>
+        </w:rPr>
+        <w:t xml:space="preserve">[עמ' 2]</w:t>
+      </w:r>
+    </w:p>
+    <w:p>
+      <w:pPr>
+        <w:bidi/>
+        <w:spacing w:after="120" w:line="360"/>
+        <w:jc w:val="both"/>
+      </w:pPr>
+      <w:r>
+        <w:rPr>
+          <w:rFonts w:ascii="David" w:cs="David" w:eastAsia="David" w:hAnsi="David"/>
+          <w:sz w:val="24"/>
+          <w:szCs w:val="24"/>
+          <w:rtl/>
+        </w:rPr>
+        <w:t xml:space="preserve">חלולים, בלי גוף, בלי כלום, סתם קולות." ואבא היה לוחש, "אנחנו עוד נחזור, שיפמן, מצאת לך עם מי להסתבך." והם היו חוזרים אחריו. והם תמיד חזרו, האנשים החלולים, ואנחנו תמיד התחבאנו.</w:t>
+      </w:r>
+    </w:p>
+    <w:p>
+      <w:pPr>
+        <w:bidi/>
+        <w:spacing w:after="120" w:line="360"/>
+        <w:jc w:val="both"/>
+      </w:pPr>
+      <w:r>
+        <w:rPr>
+          <w:rFonts w:ascii="David" w:cs="David" w:eastAsia="David" w:hAnsi="David"/>
+          <w:sz w:val="24"/>
+          <w:szCs w:val="24"/>
+          <w:rtl/>
+        </w:rPr>
+        <w:t xml:space="preserve">ואמא מתה בלי קול אבל עם גוף, והלכנו לקבור אותה. הבאנו אתנו גם איש שיבכה עליה ואבא הראה לי בספר בדיוק איזה בכיות כי גם האיש הזה היה מהם. ושבוע היה שקט, ואחר-כך שוב פעם הם באו. אנחנו המשכנו להתכרבל בפינה, לפעמים אבא היה אומר את מה שיגידו ולפעמים אני. ובפנים התפלאתי על זה שפעם פחדתי כל-כך והיום המלים שלי חוזרות מהם כמו כדור טניס שזרקתי על קיר. סתם, ממש סתם. וגם אבא מת בפינה שם ליד הפסנתר, כשאני מחבק אותו את החיבוק שהיה מחבק אותי כשעוד פחדתי. הוא שתק כשהורדנו אותו לקבר, והוא שתק כשהאיש בכה את הבכיות שידעתי שיבכה מהספר, והוא המשיך לשתוק גם כשכיסינו אותו באדמה. ואני</w:t>
+      </w:r>
+    </w:p>
+    <w:p>
+      <w:pPr>
+        <w:bidi/>
+        <w:spacing w:after="60" w:before="160" w:line="360"/>
+        <w:jc w:val="right"/>
+      </w:pPr>
+      <w:r>
+        <w:rPr>
+          <w:rFonts w:ascii="David" w:cs="David" w:eastAsia="David" w:hAnsi="David"/>
+          <w:b/>
+          <w:bCs/>
+          <w:color w:val="555555"/>
+          <w:sz w:val="20"/>
+          <w:szCs w:val="20"/>
+          <w:rtl/>
+        </w:rPr>
+        <w:t xml:space="preserve">[עמ' 3]</w:t>
+      </w:r>
+    </w:p>
+    <w:p>
+      <w:pPr>
+        <w:bidi/>
+        <w:spacing w:after="120" w:line="360"/>
+        <w:jc w:val="both"/>
+      </w:pPr>
+      <w:r>
+        <w:rPr>
+          <w:rFonts w:ascii="David" w:cs="David" w:eastAsia="David" w:hAnsi="David"/>
+          <w:sz w:val="24"/>
+          <w:szCs w:val="24"/>
+          <w:rtl/>
+        </w:rPr>
+        <w:t xml:space="preserve">שתקתי אחריו כי בסופו של דבר גם אני, כנראה, הייתי אחד מהם.</w:t>
+      </w:r>
+    </w:p>
+    <w:p>
+      <w:r>
+        <w:br w:type="page"/>
+      </w:r>
+    </w:p>
+    <w:p>
+      <w:pPr>
+        <w:pStyle w:val="Heading2"/>
+        <w:bidi/>
+        <w:spacing w:after="120" w:before="240" w:line="360"/>
+        <w:jc w:val="right"/>
+      </w:pPr>
+      <w:r>
+        <w:rPr>
+          <w:rFonts w:ascii="David" w:cs="David" w:eastAsia="David" w:hAnsi="David"/>
+          <w:b/>
+          <w:bCs/>
+          <w:sz w:val="28"/>
+          <w:szCs w:val="28"/>
+          <w:rtl/>
+        </w:rPr>
+        <w:t xml:space="preserve">נספח ב: "מי כמונו יודע" (מתוך אוטוקורקט, 2024)</w:t>
+      </w:r>
+    </w:p>
+    <w:p>
+      <w:pPr>
+        <w:bidi/>
+        <w:spacing w:after="60" w:before="160" w:line="360"/>
+        <w:jc w:val="right"/>
+      </w:pPr>
+      <w:r>
+        <w:rPr>
+          <w:rFonts w:ascii="David" w:cs="David" w:eastAsia="David" w:hAnsi="David"/>
+          <w:b/>
+          <w:bCs/>
+          <w:color w:val="555555"/>
+          <w:sz w:val="20"/>
+          <w:szCs w:val="20"/>
+          <w:rtl/>
+        </w:rPr>
+        <w:t xml:space="preserve">[עמ' 1]</w:t>
+      </w:r>
+    </w:p>
+    <w:p>
+      <w:pPr>
+        <w:bidi/>
+        <w:spacing w:after="120" w:line="360"/>
+        <w:jc w:val="both"/>
+      </w:pPr>
+      <w:r>
+        <w:rPr>
+          <w:rFonts w:ascii="David" w:cs="David" w:eastAsia="David" w:hAnsi="David"/>
+          <w:sz w:val="24"/>
+          <w:szCs w:val="24"/>
+          <w:rtl/>
+        </w:rPr>
+        <w:t xml:space="preserve">האיש שישב מולי בבית הקפה לא הפסיק לדבר. הוא היה אמריקאי, וסיפר לי שכתב שלושה ספרים, שאחד מהם זכה בפרס בינלאומי חשוב מאוד שלא שמעתי עליו מעולם. הוא דיבר מהר, כאילו יש לו יותר מדי דברים להגיד והוא חייב להספיק את כולם, וכל משפט שני שלו התחיל ב"ומי כמונו יודע..." זה גרם לי להרגיש כאילו אנחנו ישות אחת, תאומים סיאמיים שאמנם יכולים לנופף עצמאית, כל אחד בזרועותיו שלו, אבל חולקים לב אחד גדול וכואב שפועם כמו מטרונום ענקי שרק הוא ואני יכולים לשמוע. "...ומי כמונו יודע," הוא אמר שוב, "שיצירה היא בסך הכל פעולת הסחה. מראית עין של מציאות קרנבלית רוחשת שאמורה להסיח את דעתנו מהמציאות האמיתית הקרה,</w:t>
+      </w:r>
+    </w:p>
+    <w:p>
+      <w:pPr>
+        <w:bidi/>
+        <w:spacing w:after="60" w:before="160" w:line="360"/>
+        <w:jc w:val="right"/>
+      </w:pPr>
+      <w:r>
+        <w:rPr>
+          <w:rFonts w:ascii="David" w:cs="David" w:eastAsia="David" w:hAnsi="David"/>
+          <w:b/>
+          <w:bCs/>
+          <w:color w:val="555555"/>
+          <w:sz w:val="20"/>
+          <w:szCs w:val="20"/>
+          <w:rtl/>
+        </w:rPr>
+        <w:t xml:space="preserve">[עמ' 2]</w:t>
+      </w:r>
+    </w:p>
+    <w:p>
+      <w:pPr>
+        <w:bidi/>
+        <w:spacing w:after="120" w:line="360"/>
+        <w:jc w:val="both"/>
+      </w:pPr>
+      <w:r>
+        <w:rPr>
+          <w:rFonts w:ascii="David" w:cs="David" w:eastAsia="David" w:hAnsi="David"/>
+          <w:sz w:val="24"/>
+          <w:szCs w:val="24"/>
+          <w:rtl/>
+        </w:rPr>
+        <w:t xml:space="preserve">המאכזבת ונטולת הנשמה."</w:t>
+      </w:r>
+    </w:p>
+    <w:p>
+      <w:pPr>
+        <w:bidi/>
+        <w:spacing w:after="120" w:line="360"/>
+        <w:jc w:val="both"/>
+      </w:pPr>
+      <w:r>
+        <w:rPr>
+          <w:rFonts w:ascii="David" w:cs="David" w:eastAsia="David" w:hAnsi="David"/>
+          <w:sz w:val="24"/>
+          <w:szCs w:val="24"/>
+          <w:rtl/>
+        </w:rPr>
+        <w:t xml:space="preserve">הסופר האמריקאי למד כתיבה באוניברסיטה נחשבת במידווסט וסיים את לימודיו שם בהצטיינות. הוא הקים משפחה, איבד ילד בתאונת דרכים נוראה, התגרש, התגייר, התפקר והצטרף לתנועה חברתית עולמית הדוגלת במינימליזם. הוא סיפר לי בגאווה שיש בבעלותו רק שני זוגות תחתונים ועט אחד. "בנאדם צריך תמיד שיהיה לו עוד זוג תחתונים, להחלפה, אבל עט?" הוא קרץ לי, "אחד זה די והותר."</w:t>
+      </w:r>
+    </w:p>
+    <w:p>
+      <w:pPr>
+        <w:bidi/>
+        <w:spacing w:after="120" w:line="360"/>
+        <w:jc w:val="both"/>
+      </w:pPr>
+      <w:r>
+        <w:rPr>
+          <w:rFonts w:ascii="David" w:cs="David" w:eastAsia="David" w:hAnsi="David"/>
+          <w:sz w:val="24"/>
+          <w:szCs w:val="24"/>
+          <w:rtl/>
+        </w:rPr>
+        <w:t xml:space="preserve">אמרתי לו שאני כותב במחשב, והוא נד בראשו בעצב. "זה מציב אותך בעמדת חולשה," הוא התריע. "עט זה עט, אבל מחשב זה כבר חשמל, תמיכה טכנית, עדכוני תוכנה ועוד כל מיני דברים שיכולים לעמוד בינך לבין היצירה." הינהנתי. אולי באמת עדיף לכתוב בעט. "אם זאת לא שאלה אישית מדי," הוא אמר בקול רך, "כמה זוגות תחתונים יש לך בארון?" אמרתי לו שאני לא זוכר. ידעתי שיש לי לפחות עשרים, אבל פחדתי</w:t>
+      </w:r>
+    </w:p>
+    <w:p>
+      <w:pPr>
+        <w:bidi/>
+        <w:spacing w:after="60" w:before="160" w:line="360"/>
+        <w:jc w:val="right"/>
+      </w:pPr>
+      <w:r>
+        <w:rPr>
+          <w:rFonts w:ascii="David" w:cs="David" w:eastAsia="David" w:hAnsi="David"/>
+          <w:b/>
+          <w:bCs/>
+          <w:color w:val="555555"/>
+          <w:sz w:val="20"/>
+          <w:szCs w:val="20"/>
+          <w:rtl/>
+        </w:rPr>
+        <w:t xml:space="preserve">[עמ' 3]</w:t>
+      </w:r>
+    </w:p>
+    <w:p>
+      <w:pPr>
+        <w:bidi/>
+        <w:spacing w:after="120" w:line="360"/>
+        <w:jc w:val="both"/>
+      </w:pPr>
+      <w:r>
+        <w:rPr>
+          <w:rFonts w:ascii="David" w:cs="David" w:eastAsia="David" w:hAnsi="David"/>
+          <w:sz w:val="24"/>
+          <w:szCs w:val="24"/>
+          <w:rtl/>
+        </w:rPr>
+        <w:t xml:space="preserve">להעלות את זה. פחדתי שזה ירחיק בינינו. "תראה איזו שקיעה," אמר לי הסופר האמריקאי והצביע אל מעבר לכתפי הימנית. הסתובבתי אחורה מתוך נימוס. השמש בדיוק התחילה לשקוע בים. "אני ואתה, אנחנו בני מזל," הוא אמר. "תחשוב על זה. בזמן שהאדם הממוצע חווה את יופייה של השקיעה רק לרגע קצר אחד, אתה ואני יכולים, בעזרת הכתיבה, לשמר את היופי הזה לנצח." זאת באמת היתה שקיעה יפה, אבל הצוואר שלי התחיל לכאוב. "אני הולך לכתוב על השקיעה הזאת," אמר לי הסופר האמריקאי בטון נחוש שנשמע כמעט כמו איום. "גם אני," אמרתי, "גם אני." כבר אז ידעתי שהסיפור הבא שלי הולך להיות על מישהו שנתפס לו הצוואר.</w:t>
+      </w:r>
+    </w:p>
     <w:sectPr>
       <w:pgSz w:w="11906" w:h="16838" w:orient="portrait"/>
       <w:pgMar w:top="1440" w:right="1440" w:bottom="1440" w:left="1440" w:header="708" w:footer="708" w:gutter="0"/>

</xml_diff>

<commit_message>
Attach the scanned story pages as appendices
Crop, stitch and invert the six story pages from the phone screenshots
and embed them in the appendices in place of the typed transcription.

Co-Authored-By: Claude Fable 5.1 <noreply@anthropic.com>
Claude-Session: https://claude.ai/code/session_012ZD2wAUBZdU4RRE8wFJx9h
</commit_message>
<xml_diff>
--- a/seminar/סמינריון-פרקים-2-4-ניתוח-הסיפורים.docx
+++ b/seminar/סמינריון-פרקים-2-4-ניתוח-הסיפורים.docx
@@ -2242,7 +2242,7 @@
         </w:rPr>
         <w:t xml:space="preserve">, כג(41), 97-130. </w:t>
       </w:r>
-      <w:hyperlink w:history="1" r:id="rIdp4dhefy9asywlejcpo35u">
+      <w:hyperlink w:history="1" r:id="rIdrgumsuvhizhsfhkosltgk">
         <w:r>
           <w:rPr>
             <w:rFonts w:ascii="David" w:cs="David" w:eastAsia="David" w:hAnsi="David"/>
@@ -2291,7 +2291,7 @@
         </w:rPr>
         <w:t xml:space="preserve">, ד, 20-41. </w:t>
       </w:r>
-      <w:hyperlink w:history="1" r:id="rId6kvykcpxs-9vzyiijqyoj">
+      <w:hyperlink w:history="1" r:id="rId5adg2zwm2yl7x9xaxsx73">
         <w:r>
           <w:rPr>
             <w:rFonts w:ascii="David" w:cs="David" w:eastAsia="David" w:hAnsi="David"/>
@@ -2410,7 +2410,7 @@
         </w:rPr>
         <w:t xml:space="preserve">, 21-33. </w:t>
       </w:r>
-      <w:hyperlink w:history="1" r:id="rIdnahpkunen2ldotedrnrk0">
+      <w:hyperlink w:history="1" r:id="rIdzhak0eer90okzenbuy7vs">
         <w:r>
           <w:rPr>
             <w:rFonts w:ascii="David" w:cs="David" w:eastAsia="David" w:hAnsi="David"/>
@@ -2488,7 +2488,7 @@
         </w:rPr>
         <w:t xml:space="preserve">, Winter 2018, 1-24. </w:t>
       </w:r>
-      <w:hyperlink w:history="1" r:id="rIddfvlkhchmtckkcp9gx4oj">
+      <w:hyperlink w:history="1" r:id="rIdx7wr49dk-heevbrjfcg6j">
         <w:r>
           <w:rPr>
             <w:rFonts w:ascii="David" w:cs="David" w:eastAsia="David" w:hAnsi="David"/>
@@ -2533,7 +2533,7 @@
         </w:rPr>
         <w:t xml:space="preserve">(4), Article 137. </w:t>
       </w:r>
-      <w:hyperlink w:history="1" r:id="rIdaxdzy0t6lq1skvaupkw46">
+      <w:hyperlink w:history="1" r:id="rId8wdbpcnjqg_0mkamote4j">
         <w:r>
           <w:rPr>
             <w:rFonts w:ascii="David" w:cs="David" w:eastAsia="David" w:hAnsi="David"/>
@@ -2578,7 +2578,7 @@
         </w:rPr>
         <w:t xml:space="preserve">(8), 681-714. </w:t>
       </w:r>
-      <w:hyperlink w:history="1" r:id="rIdmi0lg1zw7jemscl0ggy0q">
+      <w:hyperlink w:history="1" r:id="rIdq4olfdhrs3hipgja7gjvy">
         <w:r>
           <w:rPr>
             <w:rFonts w:ascii="David" w:cs="David" w:eastAsia="David" w:hAnsi="David"/>
@@ -2623,7 +2623,7 @@
         </w:rPr>
         <w:t xml:space="preserve">, Winter 2018, 1-24. (Original work published 2017 in Hebrew Studies, 58, 425-443) </w:t>
       </w:r>
-      <w:hyperlink w:history="1" r:id="rIdx7x9hmu0sgcpbmkskrtjj">
+      <w:hyperlink w:history="1" r:id="rIdsxlllmjyaxj5xv9_cdtnv">
         <w:r>
           <w:rPr>
             <w:rFonts w:ascii="David" w:cs="David" w:eastAsia="David" w:hAnsi="David"/>
@@ -2673,7 +2673,7 @@
           <w:szCs w:val="24"/>
           <w:rtl/>
         </w:rPr>
-        <w:t xml:space="preserve">להלן נוסח שני הסיפורים כפי שהוא מופיע בקובץ הסרוק. ב"האנשים החלולים" מצוינים בסוגריים מספרי העמודים בספר (עמ' 16-17 במהדורת זמורה-ביתן), שאליהם מפנים הציטוטים בגוף העבודה. ב"מי כמונו יודע" מצוינים מספרי העמודים של הסריקה (נספח ב, עמ' 1-3).</w:t>
+        <w:t xml:space="preserve">להלן שני הסיפורים כפי שהם מופיעים בקובץ הסרוק. "האנשים החלולים" נדפס בעמ' 16-17 של געגועי לקיסינג'ר (זמורה-ביתן), ואליהם מפנים הציטוטים בגוף העבודה. ב"מי כמונו יודע" הציטוטים מפנים לעמודי הסריקה (נספח ב, עמ' 1-3).</w:t>
       </w:r>
     </w:p>
     <w:p>
@@ -2697,72 +2697,150 @@
     </w:p>
     <w:p>
       <w:pPr>
-        <w:bidi/>
-        <w:spacing w:after="60" w:before="160" w:line="360"/>
-        <w:jc w:val="right"/>
-      </w:pPr>
-      <w:r>
-        <w:rPr>
-          <w:rFonts w:ascii="David" w:cs="David" w:eastAsia="David" w:hAnsi="David"/>
-          <w:b/>
-          <w:bCs/>
-          <w:color w:val="555555"/>
-          <w:sz w:val="20"/>
-          <w:szCs w:val="20"/>
-          <w:rtl/>
-        </w:rPr>
-        <w:t xml:space="preserve">[עמ' 16 בספר]</w:t>
-      </w:r>
-    </w:p>
-    <w:p>
-      <w:pPr>
-        <w:bidi/>
-        <w:spacing w:after="120" w:line="360"/>
-        <w:jc w:val="both"/>
-      </w:pPr>
-      <w:r>
-        <w:rPr>
-          <w:rFonts w:ascii="David" w:cs="David" w:eastAsia="David" w:hAnsi="David"/>
-          <w:sz w:val="24"/>
-          <w:szCs w:val="24"/>
-          <w:rtl/>
-        </w:rPr>
-        <w:t xml:space="preserve">כשהייתי ילד היו באים אלינו כל מיני אנשים הביתה ודופקים בדלת. אבא היה מסתכל בחור של העינית אבל לא פותח. והם היו דופקים על הדלת, דופקים בפראות, ואני הייתי קצת מפחד מהם. אבל אבא היה תמיד ניגש אלי ונשכב לידי על השטיח, נשען עם הגב שלו על דופן הפסנתר ומחבק אותי חזק-חזק. "אל תפחד," היה לוחש, "אין ממה לפחד, זה בסך הכול האנשים החלולים." ואבא היה לוחש לי באוזן, "שיפמן, תפתח את הדלת. אנחנו יודעים שאתה שם," והאנשים היו חוזרים אחרי שנייה על הדברים של אבא, רק בקול. ואז הם היו מקיפים את הבית כמה פעמים, מנסים לפתוח את התריסים מבחוץ, ואבא היה ממלמל לי בשקט באוזן והם היו ממלמלים בחוץ אחריו, כמו הד. "אתה רואה," היה ממשיך אבא ללחוש, "אין ממה לפחד. הם אנשים חלולים, בלי גוף, בלי כלום, סתם קולות." ואבא היה לוחש, "אנחנו עוד נחזור, שיפמן, מצאת לך עם מי להסתבך." והם היו חוזרים אחריו. והם תמיד חזרו, האנשים החלולים, ואנחנו תמיד התחבאנו.</w:t>
-      </w:r>
-    </w:p>
-    <w:p>
-      <w:pPr>
-        <w:bidi/>
-        <w:spacing w:after="60" w:before="160" w:line="360"/>
-        <w:jc w:val="right"/>
-      </w:pPr>
-      <w:r>
-        <w:rPr>
-          <w:rFonts w:ascii="David" w:cs="David" w:eastAsia="David" w:hAnsi="David"/>
-          <w:b/>
-          <w:bCs/>
-          <w:color w:val="555555"/>
-          <w:sz w:val="20"/>
-          <w:szCs w:val="20"/>
-          <w:rtl/>
-        </w:rPr>
-        <w:t xml:space="preserve">[עמ' 17 בספר]</w:t>
-      </w:r>
-    </w:p>
-    <w:p>
-      <w:pPr>
-        <w:bidi/>
-        <w:spacing w:after="120" w:line="360"/>
-        <w:jc w:val="both"/>
-      </w:pPr>
-      <w:r>
-        <w:rPr>
-          <w:rFonts w:ascii="David" w:cs="David" w:eastAsia="David" w:hAnsi="David"/>
-          <w:sz w:val="24"/>
-          <w:szCs w:val="24"/>
-          <w:rtl/>
-        </w:rPr>
-        <w:t xml:space="preserve">ואמא מתה בלי קול אבל עם גוף, והלכנו לקבור אותה. הבאנו אתנו גם איש שיבכה עליה ואבא הראה לי בספר בדיוק איזה בכיות כי גם האיש הזה היה מהם. ושבוע היה שקט, ואחר-כך שוב פעם הם באו. אנחנו המשכנו להתכרבל בפינה, לפעמים אבא היה אומר את מה שיגידו ולפעמים אני. ובפנים התפלאתי על זה שפעם פחדתי כל-כך והיום המלים שלי חוזרות מהם כמו כדור טניס שזרקתי על קיר. סתם, ממש סתם. וגם אבא מת בפינה שם ליד הפסנתר, כשאני מחבק אותו את החיבוק שהיה מחבק אותי כשעוד פחדתי. הוא שתק כשהורדנו אותו לקבר, והוא שתק כשהאיש בכה את הבכיות שידעתי שיבכה מהספר, והוא המשיך לשתוק גם כשכיסינו אותו באדמה. ואני שתקתי אחריו כי בסופו של דבר גם אני, כנראה, הייתי אחד מהם.</w:t>
+        <w:spacing w:after="120" w:before="0"/>
+        <w:jc w:val="center"/>
+      </w:pPr>
+      <w:r>
+        <w:drawing>
+          <wp:inline distT="0" distB="0" distL="0" distR="0">
+            <wp:extent cx="3543300" cy="7534275"/>
+            <wp:effectExtent t="0" r="0" b="0" l="0"/>
+            <wp:docPr id="1" name="" descr="" title=""/>
+            <wp:cNvGraphicFramePr>
+              <a:graphicFrameLocks xmlns:a="http://schemas.openxmlformats.org/drawingml/2006/main" noChangeAspect="1"/>
+            </wp:cNvGraphicFramePr>
+            <a:graphic xmlns:a="http://schemas.openxmlformats.org/drawingml/2006/main">
+              <a:graphicData uri="http://schemas.openxmlformats.org/drawingml/2006/picture">
+                <pic:pic xmlns:pic="http://schemas.openxmlformats.org/drawingml/2006/picture">
+                  <pic:nvPicPr>
+                    <pic:cNvPr id="0" name="" descr=""/>
+                    <pic:cNvPicPr>
+                      <a:picLocks noChangeAspect="1" noChangeArrowheads="1"/>
+                    </pic:cNvPicPr>
+                  </pic:nvPicPr>
+                  <pic:blipFill>
+                    <a:blip r:embed="rId7" cstate="none"/>
+                    <a:srcRect/>
+                    <a:stretch>
+                      <a:fillRect/>
+                    </a:stretch>
+                  </pic:blipFill>
+                  <pic:spPr bwMode="auto">
+                    <a:xfrm>
+                      <a:off x="0" y="0"/>
+                      <a:ext cx="3543300" cy="7534275"/>
+                    </a:xfrm>
+                    <a:prstGeom prst="rect">
+                      <a:avLst/>
+                    </a:prstGeom>
+                  </pic:spPr>
+                </pic:pic>
+              </a:graphicData>
+            </a:graphic>
+          </wp:inline>
+        </w:drawing>
+      </w:r>
+    </w:p>
+    <w:p>
+      <w:r>
+        <w:br w:type="page"/>
+      </w:r>
+    </w:p>
+    <w:p>
+      <w:pPr>
+        <w:spacing w:after="120" w:before="0"/>
+        <w:jc w:val="center"/>
+      </w:pPr>
+      <w:r>
+        <w:drawing>
+          <wp:inline distT="0" distB="0" distL="0" distR="0">
+            <wp:extent cx="3543300" cy="7458075"/>
+            <wp:effectExtent t="0" r="0" b="0" l="0"/>
+            <wp:docPr id="1" name="" descr="" title=""/>
+            <wp:cNvGraphicFramePr>
+              <a:graphicFrameLocks xmlns:a="http://schemas.openxmlformats.org/drawingml/2006/main" noChangeAspect="1"/>
+            </wp:cNvGraphicFramePr>
+            <a:graphic xmlns:a="http://schemas.openxmlformats.org/drawingml/2006/main">
+              <a:graphicData uri="http://schemas.openxmlformats.org/drawingml/2006/picture">
+                <pic:pic xmlns:pic="http://schemas.openxmlformats.org/drawingml/2006/picture">
+                  <pic:nvPicPr>
+                    <pic:cNvPr id="0" name="" descr=""/>
+                    <pic:cNvPicPr>
+                      <a:picLocks noChangeAspect="1" noChangeArrowheads="1"/>
+                    </pic:cNvPicPr>
+                  </pic:nvPicPr>
+                  <pic:blipFill>
+                    <a:blip r:embed="rId8" cstate="none"/>
+                    <a:srcRect/>
+                    <a:stretch>
+                      <a:fillRect/>
+                    </a:stretch>
+                  </pic:blipFill>
+                  <pic:spPr bwMode="auto">
+                    <a:xfrm>
+                      <a:off x="0" y="0"/>
+                      <a:ext cx="3543300" cy="7458075"/>
+                    </a:xfrm>
+                    <a:prstGeom prst="rect">
+                      <a:avLst/>
+                    </a:prstGeom>
+                  </pic:spPr>
+                </pic:pic>
+              </a:graphicData>
+            </a:graphic>
+          </wp:inline>
+        </w:drawing>
+      </w:r>
+    </w:p>
+    <w:p>
+      <w:r>
+        <w:br w:type="page"/>
+      </w:r>
+    </w:p>
+    <w:p>
+      <w:pPr>
+        <w:spacing w:after="120" w:before="0"/>
+        <w:jc w:val="center"/>
+      </w:pPr>
+      <w:r>
+        <w:drawing>
+          <wp:inline distT="0" distB="0" distL="0" distR="0">
+            <wp:extent cx="3543300" cy="3238500"/>
+            <wp:effectExtent t="0" r="0" b="0" l="0"/>
+            <wp:docPr id="1" name="" descr="" title=""/>
+            <wp:cNvGraphicFramePr>
+              <a:graphicFrameLocks xmlns:a="http://schemas.openxmlformats.org/drawingml/2006/main" noChangeAspect="1"/>
+            </wp:cNvGraphicFramePr>
+            <a:graphic xmlns:a="http://schemas.openxmlformats.org/drawingml/2006/main">
+              <a:graphicData uri="http://schemas.openxmlformats.org/drawingml/2006/picture">
+                <pic:pic xmlns:pic="http://schemas.openxmlformats.org/drawingml/2006/picture">
+                  <pic:nvPicPr>
+                    <pic:cNvPr id="0" name="" descr=""/>
+                    <pic:cNvPicPr>
+                      <a:picLocks noChangeAspect="1" noChangeArrowheads="1"/>
+                    </pic:cNvPicPr>
+                  </pic:nvPicPr>
+                  <pic:blipFill>
+                    <a:blip r:embed="rId9" cstate="none"/>
+                    <a:srcRect/>
+                    <a:stretch>
+                      <a:fillRect/>
+                    </a:stretch>
+                  </pic:blipFill>
+                  <pic:spPr bwMode="auto">
+                    <a:xfrm>
+                      <a:off x="0" y="0"/>
+                      <a:ext cx="3543300" cy="3238500"/>
+                    </a:xfrm>
+                    <a:prstGeom prst="rect">
+                      <a:avLst/>
+                    </a:prstGeom>
+                  </pic:spPr>
+                </pic:pic>
+              </a:graphicData>
+            </a:graphic>
+          </wp:inline>
+        </w:drawing>
       </w:r>
     </w:p>
     <w:p>
@@ -2791,139 +2869,150 @@
     </w:p>
     <w:p>
       <w:pPr>
-        <w:bidi/>
-        <w:spacing w:after="60" w:before="160" w:line="360"/>
-        <w:jc w:val="right"/>
-      </w:pPr>
-      <w:r>
-        <w:rPr>
-          <w:rFonts w:ascii="David" w:cs="David" w:eastAsia="David" w:hAnsi="David"/>
-          <w:b/>
-          <w:bCs/>
-          <w:color w:val="555555"/>
-          <w:sz w:val="20"/>
-          <w:szCs w:val="20"/>
-          <w:rtl/>
-        </w:rPr>
-        <w:t xml:space="preserve">[עמ' 1]</w:t>
-      </w:r>
-    </w:p>
-    <w:p>
-      <w:pPr>
-        <w:bidi/>
-        <w:spacing w:after="120" w:line="360"/>
-        <w:jc w:val="both"/>
-      </w:pPr>
-      <w:r>
-        <w:rPr>
-          <w:rFonts w:ascii="David" w:cs="David" w:eastAsia="David" w:hAnsi="David"/>
-          <w:sz w:val="24"/>
-          <w:szCs w:val="24"/>
-          <w:rtl/>
-        </w:rPr>
-        <w:t xml:space="preserve">האיש שישב מולי בבית הקפה לא הפסיק לדבר. הוא היה אמריקאי, וסיפר לי שכתב שלושה ספרים, שאחד מהם זכה בפרס בינלאומי חשוב מאוד שלא שמעתי עליו מעולם. הוא דיבר מהר, כאילו יש לו יותר מדי דברים להגיד והוא חייב להספיק את כולם, וכל משפט שני שלו התחיל ב"ומי כמונו יודע..." זה גרם לי להרגיש כאילו אנחנו ישות אחת, תאומים סיאמיים שאמנם יכולים לנופף עצמאית, כל אחד בזרועותיו שלו, אבל חולקים לב אחד גדול וכואב שפועם כמו מטרונום ענקי שרק הוא ואני יכולים לשמוע. "...ומי כמונו יודע," הוא אמר שוב, "שיצירה היא בסך הכל פעולת הסחה. מראית עין של מציאות קרנבלית רוחשת שאמורה להסיח את דעתנו מהמציאות האמיתית הקרה,</w:t>
-      </w:r>
-    </w:p>
-    <w:p>
-      <w:pPr>
-        <w:bidi/>
-        <w:spacing w:after="60" w:before="160" w:line="360"/>
-        <w:jc w:val="right"/>
-      </w:pPr>
-      <w:r>
-        <w:rPr>
-          <w:rFonts w:ascii="David" w:cs="David" w:eastAsia="David" w:hAnsi="David"/>
-          <w:b/>
-          <w:bCs/>
-          <w:color w:val="555555"/>
-          <w:sz w:val="20"/>
-          <w:szCs w:val="20"/>
-          <w:rtl/>
-        </w:rPr>
-        <w:t xml:space="preserve">[עמ' 2]</w:t>
-      </w:r>
-    </w:p>
-    <w:p>
-      <w:pPr>
-        <w:bidi/>
-        <w:spacing w:after="120" w:line="360"/>
-        <w:jc w:val="both"/>
-      </w:pPr>
-      <w:r>
-        <w:rPr>
-          <w:rFonts w:ascii="David" w:cs="David" w:eastAsia="David" w:hAnsi="David"/>
-          <w:sz w:val="24"/>
-          <w:szCs w:val="24"/>
-          <w:rtl/>
-        </w:rPr>
-        <w:t xml:space="preserve">המאכזבת ונטולת הנשמה."</w:t>
-      </w:r>
-    </w:p>
-    <w:p>
-      <w:pPr>
-        <w:bidi/>
-        <w:spacing w:after="120" w:line="360"/>
-        <w:jc w:val="both"/>
-      </w:pPr>
-      <w:r>
-        <w:rPr>
-          <w:rFonts w:ascii="David" w:cs="David" w:eastAsia="David" w:hAnsi="David"/>
-          <w:sz w:val="24"/>
-          <w:szCs w:val="24"/>
-          <w:rtl/>
-        </w:rPr>
-        <w:t xml:space="preserve">הסופר האמריקאי למד כתיבה באוניברסיטה נחשבת במידווסט וסיים את לימודיו שם בהצטיינות. הוא הקים משפחה, איבד ילד בתאונת דרכים נוראה, התגרש, התגייר, התפקר והצטרף לתנועה חברתית עולמית הדוגלת במינימליזם. הוא סיפר לי בגאווה שיש בבעלותו רק שני זוגות תחתונים ועט אחד. "בנאדם צריך תמיד שיהיה לו עוד זוג תחתונים, להחלפה, אבל עט?" הוא קרץ לי, "אחד זה די והותר."</w:t>
-      </w:r>
-    </w:p>
-    <w:p>
-      <w:pPr>
-        <w:bidi/>
-        <w:spacing w:after="120" w:line="360"/>
-        <w:jc w:val="both"/>
-      </w:pPr>
-      <w:r>
-        <w:rPr>
-          <w:rFonts w:ascii="David" w:cs="David" w:eastAsia="David" w:hAnsi="David"/>
-          <w:sz w:val="24"/>
-          <w:szCs w:val="24"/>
-          <w:rtl/>
-        </w:rPr>
-        <w:t xml:space="preserve">אמרתי לו שאני כותב במחשב, והוא נד בראשו בעצב. "זה מציב אותך בעמדת חולשה," הוא התריע. "עט זה עט, אבל מחשב זה כבר חשמל, תמיכה טכנית, עדכוני תוכנה ועוד כל מיני דברים שיכולים לעמוד בינך לבין היצירה." הינהנתי. אולי באמת עדיף לכתוב בעט. "אם זאת לא שאלה אישית מדי," הוא אמר בקול רך, "כמה זוגות תחתונים יש לך בארון?" אמרתי לו שאני לא זוכר. ידעתי שיש לי לפחות עשרים, אבל פחדתי</w:t>
-      </w:r>
-    </w:p>
-    <w:p>
-      <w:pPr>
-        <w:bidi/>
-        <w:spacing w:after="60" w:before="160" w:line="360"/>
-        <w:jc w:val="right"/>
-      </w:pPr>
-      <w:r>
-        <w:rPr>
-          <w:rFonts w:ascii="David" w:cs="David" w:eastAsia="David" w:hAnsi="David"/>
-          <w:b/>
-          <w:bCs/>
-          <w:color w:val="555555"/>
-          <w:sz w:val="20"/>
-          <w:szCs w:val="20"/>
-          <w:rtl/>
-        </w:rPr>
-        <w:t xml:space="preserve">[עמ' 3]</w:t>
-      </w:r>
-    </w:p>
-    <w:p>
-      <w:pPr>
-        <w:bidi/>
-        <w:spacing w:after="120" w:line="360"/>
-        <w:jc w:val="both"/>
-      </w:pPr>
-      <w:r>
-        <w:rPr>
-          <w:rFonts w:ascii="David" w:cs="David" w:eastAsia="David" w:hAnsi="David"/>
-          <w:sz w:val="24"/>
-          <w:szCs w:val="24"/>
-          <w:rtl/>
-        </w:rPr>
-        <w:t xml:space="preserve">להעלות את זה. פחדתי שזה ירחיק בינינו. "תראה איזו שקיעה," אמר לי הסופר האמריקאי והצביע אל מעבר לכתפי הימנית. הסתובבתי אחורה מתוך נימוס. השמש בדיוק התחילה לשקוע בים. "אני ואתה, אנחנו בני מזל," הוא אמר. "תחשוב על זה. בזמן שהאדם הממוצע חווה את יופייה של השקיעה רק לרגע קצר אחד, אתה ואני יכולים, בעזרת הכתיבה, לשמר את היופי הזה לנצח." זאת באמת היתה שקיעה יפה, אבל הצוואר שלי התחיל לכאוב. "אני הולך לכתוב על השקיעה הזאת," אמר לי הסופר האמריקאי בטון נחוש שנשמע כמעט כמו איום. "גם אני," אמרתי, "גם אני." כבר אז ידעתי שהסיפור הבא שלי הולך להיות על מישהו שנתפס לו הצוואר.</w:t>
+        <w:spacing w:after="120" w:before="0"/>
+        <w:jc w:val="center"/>
+      </w:pPr>
+      <w:r>
+        <w:drawing>
+          <wp:inline distT="0" distB="0" distL="0" distR="0">
+            <wp:extent cx="3543300" cy="7639050"/>
+            <wp:effectExtent t="0" r="0" b="0" l="0"/>
+            <wp:docPr id="1" name="" descr="" title=""/>
+            <wp:cNvGraphicFramePr>
+              <a:graphicFrameLocks xmlns:a="http://schemas.openxmlformats.org/drawingml/2006/main" noChangeAspect="1"/>
+            </wp:cNvGraphicFramePr>
+            <a:graphic xmlns:a="http://schemas.openxmlformats.org/drawingml/2006/main">
+              <a:graphicData uri="http://schemas.openxmlformats.org/drawingml/2006/picture">
+                <pic:pic xmlns:pic="http://schemas.openxmlformats.org/drawingml/2006/picture">
+                  <pic:nvPicPr>
+                    <pic:cNvPr id="0" name="" descr=""/>
+                    <pic:cNvPicPr>
+                      <a:picLocks noChangeAspect="1" noChangeArrowheads="1"/>
+                    </pic:cNvPicPr>
+                  </pic:nvPicPr>
+                  <pic:blipFill>
+                    <a:blip r:embed="rId10" cstate="none"/>
+                    <a:srcRect/>
+                    <a:stretch>
+                      <a:fillRect/>
+                    </a:stretch>
+                  </pic:blipFill>
+                  <pic:spPr bwMode="auto">
+                    <a:xfrm>
+                      <a:off x="0" y="0"/>
+                      <a:ext cx="3543300" cy="7639050"/>
+                    </a:xfrm>
+                    <a:prstGeom prst="rect">
+                      <a:avLst/>
+                    </a:prstGeom>
+                  </pic:spPr>
+                </pic:pic>
+              </a:graphicData>
+            </a:graphic>
+          </wp:inline>
+        </w:drawing>
+      </w:r>
+    </w:p>
+    <w:p>
+      <w:r>
+        <w:br w:type="page"/>
+      </w:r>
+    </w:p>
+    <w:p>
+      <w:pPr>
+        <w:spacing w:after="120" w:before="0"/>
+        <w:jc w:val="center"/>
+      </w:pPr>
+      <w:r>
+        <w:drawing>
+          <wp:inline distT="0" distB="0" distL="0" distR="0">
+            <wp:extent cx="3543300" cy="7667625"/>
+            <wp:effectExtent t="0" r="0" b="0" l="0"/>
+            <wp:docPr id="1" name="" descr="" title=""/>
+            <wp:cNvGraphicFramePr>
+              <a:graphicFrameLocks xmlns:a="http://schemas.openxmlformats.org/drawingml/2006/main" noChangeAspect="1"/>
+            </wp:cNvGraphicFramePr>
+            <a:graphic xmlns:a="http://schemas.openxmlformats.org/drawingml/2006/main">
+              <a:graphicData uri="http://schemas.openxmlformats.org/drawingml/2006/picture">
+                <pic:pic xmlns:pic="http://schemas.openxmlformats.org/drawingml/2006/picture">
+                  <pic:nvPicPr>
+                    <pic:cNvPr id="0" name="" descr=""/>
+                    <pic:cNvPicPr>
+                      <a:picLocks noChangeAspect="1" noChangeArrowheads="1"/>
+                    </pic:cNvPicPr>
+                  </pic:nvPicPr>
+                  <pic:blipFill>
+                    <a:blip r:embed="rId11" cstate="none"/>
+                    <a:srcRect/>
+                    <a:stretch>
+                      <a:fillRect/>
+                    </a:stretch>
+                  </pic:blipFill>
+                  <pic:spPr bwMode="auto">
+                    <a:xfrm>
+                      <a:off x="0" y="0"/>
+                      <a:ext cx="3543300" cy="7667625"/>
+                    </a:xfrm>
+                    <a:prstGeom prst="rect">
+                      <a:avLst/>
+                    </a:prstGeom>
+                  </pic:spPr>
+                </pic:pic>
+              </a:graphicData>
+            </a:graphic>
+          </wp:inline>
+        </w:drawing>
+      </w:r>
+    </w:p>
+    <w:p>
+      <w:r>
+        <w:br w:type="page"/>
+      </w:r>
+    </w:p>
+    <w:p>
+      <w:pPr>
+        <w:spacing w:after="120" w:before="0"/>
+        <w:jc w:val="center"/>
+      </w:pPr>
+      <w:r>
+        <w:drawing>
+          <wp:inline distT="0" distB="0" distL="0" distR="0">
+            <wp:extent cx="3543300" cy="6200775"/>
+            <wp:effectExtent t="0" r="0" b="0" l="0"/>
+            <wp:docPr id="1" name="" descr="" title=""/>
+            <wp:cNvGraphicFramePr>
+              <a:graphicFrameLocks xmlns:a="http://schemas.openxmlformats.org/drawingml/2006/main" noChangeAspect="1"/>
+            </wp:cNvGraphicFramePr>
+            <a:graphic xmlns:a="http://schemas.openxmlformats.org/drawingml/2006/main">
+              <a:graphicData uri="http://schemas.openxmlformats.org/drawingml/2006/picture">
+                <pic:pic xmlns:pic="http://schemas.openxmlformats.org/drawingml/2006/picture">
+                  <pic:nvPicPr>
+                    <pic:cNvPr id="0" name="" descr=""/>
+                    <pic:cNvPicPr>
+                      <a:picLocks noChangeAspect="1" noChangeArrowheads="1"/>
+                    </pic:cNvPicPr>
+                  </pic:nvPicPr>
+                  <pic:blipFill>
+                    <a:blip r:embed="rId12" cstate="none"/>
+                    <a:srcRect/>
+                    <a:stretch>
+                      <a:fillRect/>
+                    </a:stretch>
+                  </pic:blipFill>
+                  <pic:spPr bwMode="auto">
+                    <a:xfrm>
+                      <a:off x="0" y="0"/>
+                      <a:ext cx="3543300" cy="6200775"/>
+                    </a:xfrm>
+                    <a:prstGeom prst="rect">
+                      <a:avLst/>
+                    </a:prstGeom>
+                  </pic:spPr>
+                </pic:pic>
+              </a:graphicData>
+            </a:graphic>
+          </wp:inline>
+        </w:drawing>
       </w:r>
     </w:p>
     <w:sectPr>

</xml_diff>